<commit_message>
site: refine mobile navigation and participation docs
</commit_message>
<xml_diff>
--- a/public/downloads/aiadc-event-notice.docx
+++ b/public/downloads/aiadc-event-notice.docx
@@ -580,23 +580,23 @@
           <w:sz w:val="32"/>
           <w:szCs w:val="32"/>
         </w:rPr>
-        <w:t>高校组实行统一组织评审、统一排序、统一确定奖项。青年创新组为赛事开放专项组，坚持单独评审、单独排序、单独确定奖项，不与职教组、高校组在同一评价序列内混合竞争。青年创新组面向</w:t>
-      </w:r>
-      <w:r>
-        <w:rPr>
-          <w:rFonts w:ascii="方正仿宋_GB2312" w:eastAsia="方正仿宋_GB2312" w:hAnsi="方正仿宋_GB2312" w:cs="方正仿宋_GB2312" w:hint="eastAsia"/>
-          <w:sz w:val="32"/>
-          <w:szCs w:val="32"/>
-        </w:rPr>
-        <w:t>35</w:t>
-      </w:r>
-      <w:r>
-        <w:rPr>
-          <w:rFonts w:ascii="方正仿宋_GB2312" w:eastAsia="方正仿宋_GB2312" w:hAnsi="方正仿宋_GB2312" w:cs="方正仿宋_GB2312" w:hint="eastAsia"/>
-          <w:sz w:val="32"/>
-          <w:szCs w:val="32"/>
-        </w:rPr>
-        <w:t>周岁以下人员开放报名；以公司主体或团队主体参赛的，须提交相应授权、主体关系和项目权属说明。</w:t>
+        <w:t xml:space="preserve">高校组实行统一组织评审和排序。青年创新组为赛事开放专项组，坚持单独评审、单独排序，不与职教组、高校组在同一评价序列内混合竞争。青年创新组面向35周岁以下人员开放报名；以公司主体或团队主体参赛的，须提交相应授权、主体关系和项目权属说明。</w:t>
+      </w:r>
+      <w:r>
+        <w:rPr>
+          <w:rFonts w:ascii="方正仿宋_GB2312" w:eastAsia="方正仿宋_GB2312" w:hAnsi="方正仿宋_GB2312" w:cs="方正仿宋_GB2312" w:hint="eastAsia"/>
+          <w:sz w:val="32"/>
+          <w:szCs w:val="32"/>
+        </w:rPr>
+        <w:t/>
+      </w:r>
+      <w:r>
+        <w:rPr>
+          <w:rFonts w:ascii="方正仿宋_GB2312" w:eastAsia="方正仿宋_GB2312" w:hAnsi="方正仿宋_GB2312" w:cs="方正仿宋_GB2312" w:hint="eastAsia"/>
+          <w:sz w:val="32"/>
+          <w:szCs w:val="32"/>
+        </w:rPr>
+        <w:t/>
       </w:r>
     </w:p>
     <w:p>
@@ -1202,6 +1202,337 @@
           <w:sz w:val="32"/>
           <w:szCs w:val="32"/>
         </w:rPr>
+        <w:t xml:space="preserve">（2）报名征集与报名确认：2026年7月1日至9月30日受理项目报名。参赛团队应在9月30日前完成报名系统信息填报；报名期间可同步提交项目报告书、路演演示文稿、团队信息表、真实性与知识产权承诺书及项目开发与过程证明材料。</w:t>
+      </w:r>
+      <w:r>
+        <w:rPr>
+          <w:rFonts w:ascii="方正仿宋_GB2312" w:eastAsia="方正仿宋_GB2312" w:hAnsi="方正仿宋_GB2312" w:cs="方正仿宋_GB2312"/>
+          <w:sz w:val="32"/>
+          <w:szCs w:val="32"/>
+        </w:rPr>
+        <w:t/>
+      </w:r>
+      <w:r>
+        <w:rPr>
+          <w:rFonts w:ascii="宋体" w:eastAsia="宋体" w:hAnsi="宋体" w:cs="宋体" w:hint="eastAsia"/>
+          <w:sz w:val="32"/>
+          <w:szCs w:val="32"/>
+        </w:rPr>
+        <w:t/>
+      </w:r>
+      <w:r>
+        <w:rPr>
+          <w:rFonts w:ascii="___WRD_EMBED_SUB_44" w:eastAsia="___WRD_EMBED_SUB_44" w:hAnsi="___WRD_EMBED_SUB_44" w:cs="___WRD_EMBED_SUB_44" w:hint="eastAsia"/>
+          <w:sz w:val="32"/>
+          <w:szCs w:val="32"/>
+        </w:rPr>
+        <w:t/>
+      </w:r>
+      <w:r>
+        <w:rPr>
+          <w:rFonts w:ascii="宋体" w:eastAsia="宋体" w:hAnsi="宋体" w:cs="宋体" w:hint="eastAsia"/>
+          <w:sz w:val="32"/>
+          <w:szCs w:val="32"/>
+        </w:rPr>
+        <w:t/>
+      </w:r>
+      <w:r>
+        <w:rPr>
+          <w:rFonts w:ascii="___WRD_EMBED_SUB_44" w:eastAsia="___WRD_EMBED_SUB_44" w:hAnsi="___WRD_EMBED_SUB_44" w:cs="___WRD_EMBED_SUB_44" w:hint="eastAsia"/>
+          <w:sz w:val="32"/>
+          <w:szCs w:val="32"/>
+        </w:rPr>
+        <w:t/>
+      </w:r>
+      <w:r>
+        <w:rPr>
+          <w:rFonts w:ascii="宋体" w:eastAsia="宋体" w:hAnsi="宋体" w:cs="宋体" w:hint="eastAsia"/>
+          <w:sz w:val="32"/>
+          <w:szCs w:val="32"/>
+        </w:rPr>
+        <w:t/>
+      </w:r>
+      <w:r>
+        <w:rPr>
+          <w:rFonts w:ascii="___WRD_EMBED_SUB_44" w:eastAsia="___WRD_EMBED_SUB_44" w:hAnsi="___WRD_EMBED_SUB_44" w:cs="___WRD_EMBED_SUB_44" w:hint="eastAsia"/>
+          <w:sz w:val="32"/>
+          <w:szCs w:val="32"/>
+        </w:rPr>
+        <w:t/>
+      </w:r>
+      <w:r>
+        <w:rPr>
+          <w:rFonts w:ascii="方正仿宋_GB2312" w:eastAsia="方正仿宋_GB2312" w:hAnsi="方正仿宋_GB2312" w:cs="方正仿宋_GB2312"/>
+          <w:sz w:val="32"/>
+          <w:szCs w:val="32"/>
+        </w:rPr>
+        <w:t/>
+      </w:r>
+      <w:r>
+        <w:rPr>
+          <w:rFonts w:ascii="宋体" w:eastAsia="宋体" w:hAnsi="宋体" w:cs="宋体" w:hint="eastAsia"/>
+          <w:sz w:val="32"/>
+          <w:szCs w:val="32"/>
+        </w:rPr>
+        <w:t/>
+      </w:r>
+      <w:r>
+        <w:rPr>
+          <w:rFonts w:ascii="方正仿宋_GB2312" w:eastAsia="方正仿宋_GB2312" w:hAnsi="方正仿宋_GB2312" w:cs="方正仿宋_GB2312"/>
+          <w:sz w:val="32"/>
+          <w:szCs w:val="32"/>
+        </w:rPr>
+        <w:t/>
+      </w:r>
+      <w:r>
+        <w:rPr>
+          <w:rFonts w:ascii="宋体" w:eastAsia="宋体" w:hAnsi="宋体" w:cs="宋体" w:hint="eastAsia"/>
+          <w:sz w:val="32"/>
+          <w:szCs w:val="32"/>
+        </w:rPr>
+        <w:t/>
+      </w:r>
+      <w:r>
+        <w:rPr>
+          <w:rFonts w:ascii="___WRD_EMBED_SUB_44" w:eastAsia="___WRD_EMBED_SUB_44" w:hAnsi="___WRD_EMBED_SUB_44" w:cs="___WRD_EMBED_SUB_44" w:hint="eastAsia"/>
+          <w:sz w:val="32"/>
+          <w:szCs w:val="32"/>
+        </w:rPr>
+        <w:t/>
+      </w:r>
+      <w:r>
+        <w:rPr>
+          <w:rFonts w:ascii="方正仿宋_GB2312" w:eastAsia="方正仿宋_GB2312" w:hAnsi="方正仿宋_GB2312" w:cs="方正仿宋_GB2312"/>
+          <w:sz w:val="32"/>
+          <w:szCs w:val="32"/>
+        </w:rPr>
+        <w:t/>
+      </w:r>
+      <w:r>
+        <w:rPr>
+          <w:rFonts w:ascii="宋体" w:eastAsia="宋体" w:hAnsi="宋体" w:cs="宋体" w:hint="eastAsia"/>
+          <w:sz w:val="32"/>
+          <w:szCs w:val="32"/>
+        </w:rPr>
+        <w:t/>
+      </w:r>
+      <w:r>
+        <w:rPr>
+          <w:rFonts w:ascii="___WRD_EMBED_SUB_44" w:eastAsia="___WRD_EMBED_SUB_44" w:hAnsi="___WRD_EMBED_SUB_44" w:cs="___WRD_EMBED_SUB_44" w:hint="eastAsia"/>
+          <w:sz w:val="32"/>
+          <w:szCs w:val="32"/>
+        </w:rPr>
+        <w:t/>
+      </w:r>
+      <w:r>
+        <w:rPr>
+          <w:rFonts w:ascii="宋体" w:eastAsia="宋体" w:hAnsi="宋体" w:cs="宋体" w:hint="eastAsia"/>
+          <w:sz w:val="32"/>
+          <w:szCs w:val="32"/>
+        </w:rPr>
+        <w:t/>
+      </w:r>
+      <w:r>
+        <w:rPr>
+          <w:rFonts w:ascii="___WRD_EMBED_SUB_44" w:eastAsia="___WRD_EMBED_SUB_44" w:hAnsi="___WRD_EMBED_SUB_44" w:cs="___WRD_EMBED_SUB_44" w:hint="eastAsia"/>
+          <w:sz w:val="32"/>
+          <w:szCs w:val="32"/>
+        </w:rPr>
+        <w:t/>
+      </w:r>
+      <w:r>
+        <w:rPr>
+          <w:rFonts w:ascii="宋体" w:eastAsia="宋体" w:hAnsi="宋体" w:cs="宋体" w:hint="eastAsia"/>
+          <w:sz w:val="32"/>
+          <w:szCs w:val="32"/>
+        </w:rPr>
+        <w:t/>
+      </w:r>
+      <w:r>
+        <w:rPr>
+          <w:rFonts w:ascii="___WRD_EMBED_SUB_44" w:eastAsia="___WRD_EMBED_SUB_44" w:hAnsi="___WRD_EMBED_SUB_44" w:cs="___WRD_EMBED_SUB_44" w:hint="eastAsia"/>
+          <w:sz w:val="32"/>
+          <w:szCs w:val="32"/>
+        </w:rPr>
+        <w:t/>
+      </w:r>
+      <w:r>
+        <w:rPr>
+          <w:rFonts w:ascii="宋体" w:eastAsia="宋体" w:hAnsi="宋体" w:cs="宋体" w:hint="eastAsia"/>
+          <w:sz w:val="32"/>
+          <w:szCs w:val="32"/>
+        </w:rPr>
+        <w:t/>
+      </w:r>
+      <w:r>
+        <w:rPr>
+          <w:rFonts w:ascii="___WRD_EMBED_SUB_44" w:eastAsia="___WRD_EMBED_SUB_44" w:hAnsi="___WRD_EMBED_SUB_44" w:cs="___WRD_EMBED_SUB_44" w:hint="eastAsia"/>
+          <w:sz w:val="32"/>
+          <w:szCs w:val="32"/>
+        </w:rPr>
+        <w:t/>
+      </w:r>
+      <w:r>
+        <w:rPr>
+          <w:rFonts w:ascii="宋体" w:eastAsia="宋体" w:hAnsi="宋体" w:cs="宋体" w:hint="eastAsia"/>
+          <w:sz w:val="32"/>
+          <w:szCs w:val="32"/>
+        </w:rPr>
+        <w:t/>
+      </w:r>
+      <w:r>
+        <w:rPr>
+          <w:rFonts w:ascii="___WRD_EMBED_SUB_44" w:eastAsia="___WRD_EMBED_SUB_44" w:hAnsi="___WRD_EMBED_SUB_44" w:cs="___WRD_EMBED_SUB_44" w:hint="eastAsia"/>
+          <w:sz w:val="32"/>
+          <w:szCs w:val="32"/>
+        </w:rPr>
+        <w:t/>
+      </w:r>
+      <w:r>
+        <w:rPr>
+          <w:rFonts w:ascii="宋体" w:eastAsia="宋体" w:hAnsi="宋体" w:cs="宋体" w:hint="eastAsia"/>
+          <w:sz w:val="32"/>
+          <w:szCs w:val="32"/>
+        </w:rPr>
+        <w:t/>
+      </w:r>
+      <w:r>
+        <w:rPr>
+          <w:rFonts w:ascii="___WRD_EMBED_SUB_44" w:eastAsia="___WRD_EMBED_SUB_44" w:hAnsi="___WRD_EMBED_SUB_44" w:cs="___WRD_EMBED_SUB_44" w:hint="eastAsia"/>
+          <w:sz w:val="32"/>
+          <w:szCs w:val="32"/>
+        </w:rPr>
+        <w:t/>
+      </w:r>
+      <w:r>
+        <w:rPr>
+          <w:rFonts w:ascii="宋体" w:eastAsia="宋体" w:hAnsi="宋体" w:cs="宋体" w:hint="eastAsia"/>
+          <w:sz w:val="32"/>
+          <w:szCs w:val="32"/>
+        </w:rPr>
+        <w:t/>
+      </w:r>
+      <w:r>
+        <w:rPr>
+          <w:rFonts w:ascii="___WRD_EMBED_SUB_44" w:eastAsia="___WRD_EMBED_SUB_44" w:hAnsi="___WRD_EMBED_SUB_44" w:cs="___WRD_EMBED_SUB_44" w:hint="eastAsia"/>
+          <w:sz w:val="32"/>
+          <w:szCs w:val="32"/>
+        </w:rPr>
+        <w:t/>
+      </w:r>
+      <w:r>
+        <w:rPr>
+          <w:rFonts w:ascii="宋体" w:eastAsia="宋体" w:hAnsi="宋体" w:cs="宋体" w:hint="eastAsia"/>
+          <w:sz w:val="32"/>
+          <w:szCs w:val="32"/>
+        </w:rPr>
+        <w:t/>
+      </w:r>
+      <w:r>
+        <w:rPr>
+          <w:rFonts w:ascii="___WRD_EMBED_SUB_44" w:eastAsia="___WRD_EMBED_SUB_44" w:hAnsi="___WRD_EMBED_SUB_44" w:cs="___WRD_EMBED_SUB_44" w:hint="eastAsia"/>
+          <w:sz w:val="32"/>
+          <w:szCs w:val="32"/>
+        </w:rPr>
+        <w:t/>
+      </w:r>
+      <w:r>
+        <w:rPr>
+          <w:rFonts w:ascii="宋体" w:eastAsia="宋体" w:hAnsi="宋体" w:cs="宋体" w:hint="eastAsia"/>
+          <w:sz w:val="32"/>
+          <w:szCs w:val="32"/>
+        </w:rPr>
+        <w:t/>
+      </w:r>
+      <w:r>
+        <w:rPr>
+          <w:rFonts w:ascii="___WRD_EMBED_SUB_44" w:eastAsia="___WRD_EMBED_SUB_44" w:hAnsi="___WRD_EMBED_SUB_44" w:cs="___WRD_EMBED_SUB_44" w:hint="eastAsia"/>
+          <w:sz w:val="32"/>
+          <w:szCs w:val="32"/>
+        </w:rPr>
+        <w:t/>
+      </w:r>
+      <w:r>
+        <w:rPr>
+          <w:rFonts w:ascii="宋体" w:eastAsia="宋体" w:hAnsi="宋体" w:cs="宋体" w:hint="eastAsia"/>
+          <w:sz w:val="32"/>
+          <w:szCs w:val="32"/>
+        </w:rPr>
+        <w:t/>
+      </w:r>
+      <w:r>
+        <w:rPr>
+          <w:rFonts w:ascii="___WRD_EMBED_SUB_44" w:eastAsia="___WRD_EMBED_SUB_44" w:hAnsi="___WRD_EMBED_SUB_44" w:cs="___WRD_EMBED_SUB_44" w:hint="eastAsia"/>
+          <w:sz w:val="32"/>
+          <w:szCs w:val="32"/>
+        </w:rPr>
+        <w:t/>
+      </w:r>
+      <w:r>
+        <w:rPr>
+          <w:rFonts w:ascii="宋体" w:eastAsia="宋体" w:hAnsi="宋体" w:cs="宋体" w:hint="eastAsia"/>
+          <w:sz w:val="32"/>
+          <w:szCs w:val="32"/>
+        </w:rPr>
+        <w:t/>
+      </w:r>
+      <w:r>
+        <w:rPr>
+          <w:rFonts w:ascii="___WRD_EMBED_SUB_44" w:eastAsia="___WRD_EMBED_SUB_44" w:hAnsi="___WRD_EMBED_SUB_44" w:cs="___WRD_EMBED_SUB_44" w:hint="eastAsia"/>
+          <w:sz w:val="32"/>
+          <w:szCs w:val="32"/>
+        </w:rPr>
+        <w:t/>
+      </w:r>
+      <w:r>
+        <w:rPr>
+          <w:rFonts w:ascii="宋体" w:eastAsia="宋体" w:hAnsi="宋体" w:cs="宋体" w:hint="eastAsia"/>
+          <w:sz w:val="32"/>
+          <w:szCs w:val="32"/>
+        </w:rPr>
+        <w:t/>
+      </w:r>
+      <w:r>
+        <w:rPr>
+          <w:rFonts w:ascii="___WRD_EMBED_SUB_44" w:eastAsia="___WRD_EMBED_SUB_44" w:hAnsi="___WRD_EMBED_SUB_44" w:cs="___WRD_EMBED_SUB_44" w:hint="eastAsia"/>
+          <w:sz w:val="32"/>
+          <w:szCs w:val="32"/>
+        </w:rPr>
+        <w:t/>
+      </w:r>
+      <w:r>
+        <w:rPr>
+          <w:rFonts w:ascii="宋体" w:eastAsia="宋体" w:hAnsi="宋体" w:cs="宋体" w:hint="eastAsia"/>
+          <w:sz w:val="32"/>
+          <w:szCs w:val="32"/>
+        </w:rPr>
+        <w:t/>
+      </w:r>
+      <w:r>
+        <w:rPr>
+          <w:rFonts w:ascii="___WRD_EMBED_SUB_44" w:eastAsia="___WRD_EMBED_SUB_44" w:hAnsi="___WRD_EMBED_SUB_44" w:cs="___WRD_EMBED_SUB_44" w:hint="eastAsia"/>
+          <w:sz w:val="32"/>
+          <w:szCs w:val="32"/>
+        </w:rPr>
+        <w:t/>
+      </w:r>
+    </w:p>
+    <w:p>
+      <w:pPr>
+        <w:ind w:firstLineChars="200" w:firstLine="640"/>
+        <w:jc w:val="left"/>
+        <w:rPr>
+          <w:rFonts w:ascii="方正仿宋_GB2312" w:eastAsia="方正仿宋_GB2312" w:hAnsi="方正仿宋_GB2312" w:cs="方正仿宋_GB2312"/>
+          <w:sz w:val="32"/>
+          <w:szCs w:val="32"/>
+        </w:rPr>
+      </w:pPr>
+      <w:r>
+        <w:rPr>
+          <w:rFonts w:ascii="宋体" w:eastAsia="宋体" w:hAnsi="宋体" w:cs="宋体" w:hint="eastAsia"/>
+          <w:sz w:val="32"/>
+          <w:szCs w:val="32"/>
+        </w:rPr>
         <w:t>（</w:t>
       </w:r>
       <w:r>
@@ -1210,39 +1541,79 @@
           <w:sz w:val="32"/>
           <w:szCs w:val="32"/>
         </w:rPr>
-        <w:t>2</w:t>
-      </w:r>
-      <w:r>
-        <w:rPr>
-          <w:rFonts w:ascii="宋体" w:eastAsia="宋体" w:hAnsi="宋体" w:cs="宋体" w:hint="eastAsia"/>
-          <w:sz w:val="32"/>
-          <w:szCs w:val="32"/>
-        </w:rPr>
-        <w:t>）</w:t>
-      </w:r>
-      <w:r>
-        <w:rPr>
-          <w:rFonts w:ascii="___WRD_EMBED_SUB_44" w:eastAsia="___WRD_EMBED_SUB_44" w:hAnsi="___WRD_EMBED_SUB_44" w:cs="___WRD_EMBED_SUB_44" w:hint="eastAsia"/>
-          <w:sz w:val="32"/>
-          <w:szCs w:val="32"/>
-        </w:rPr>
-        <w:t>报名</w:t>
-      </w:r>
-      <w:r>
-        <w:rPr>
-          <w:rFonts w:ascii="宋体" w:eastAsia="宋体" w:hAnsi="宋体" w:cs="宋体" w:hint="eastAsia"/>
-          <w:sz w:val="32"/>
-          <w:szCs w:val="32"/>
-        </w:rPr>
-        <w:t>征集</w:t>
-      </w:r>
-      <w:r>
-        <w:rPr>
-          <w:rFonts w:ascii="___WRD_EMBED_SUB_44" w:eastAsia="___WRD_EMBED_SUB_44" w:hAnsi="___WRD_EMBED_SUB_44" w:cs="___WRD_EMBED_SUB_44" w:hint="eastAsia"/>
-          <w:sz w:val="32"/>
-          <w:szCs w:val="32"/>
-        </w:rPr>
-        <w:t>与报名确</w:t>
+        <w:t>3</w:t>
+      </w:r>
+      <w:r>
+        <w:rPr>
+          <w:rFonts w:ascii="宋体" w:eastAsia="宋体" w:hAnsi="宋体" w:cs="宋体" w:hint="eastAsia"/>
+          <w:sz w:val="32"/>
+          <w:szCs w:val="32"/>
+        </w:rPr>
+        <w:t>）初</w:t>
+      </w:r>
+      <w:r>
+        <w:rPr>
+          <w:rFonts w:ascii="___WRD_EMBED_SUB_44" w:eastAsia="___WRD_EMBED_SUB_44" w:hAnsi="___WRD_EMBED_SUB_44" w:cs="___WRD_EMBED_SUB_44" w:hint="eastAsia"/>
+          <w:sz w:val="32"/>
+          <w:szCs w:val="32"/>
+        </w:rPr>
+        <w:t>赛材料提交与资格审</w:t>
+      </w:r>
+      <w:r>
+        <w:rPr>
+          <w:rFonts w:ascii="宋体" w:eastAsia="宋体" w:hAnsi="宋体" w:cs="宋体" w:hint="eastAsia"/>
+          <w:sz w:val="32"/>
+          <w:szCs w:val="32"/>
+        </w:rPr>
+        <w:t>核</w:t>
+      </w:r>
+      <w:r>
+        <w:rPr>
+          <w:rFonts w:ascii="___WRD_EMBED_SUB_44" w:eastAsia="___WRD_EMBED_SUB_44" w:hAnsi="___WRD_EMBED_SUB_44" w:cs="___WRD_EMBED_SUB_44" w:hint="eastAsia"/>
+          <w:sz w:val="32"/>
+          <w:szCs w:val="32"/>
+        </w:rPr>
+        <w:t>：</w:t>
+      </w:r>
+      <w:r>
+        <w:rPr>
+          <w:rFonts w:ascii="方正仿宋_GB2312" w:eastAsia="方正仿宋_GB2312" w:hAnsi="方正仿宋_GB2312" w:cs="方正仿宋_GB2312"/>
+          <w:sz w:val="32"/>
+          <w:szCs w:val="32"/>
+        </w:rPr>
+        <w:t>2026年10月1日</w:t>
+      </w:r>
+      <w:r>
+        <w:rPr>
+          <w:rFonts w:ascii="宋体" w:eastAsia="宋体" w:hAnsi="宋体" w:cs="宋体" w:hint="eastAsia"/>
+          <w:sz w:val="32"/>
+          <w:szCs w:val="32"/>
+        </w:rPr>
+        <w:t>至</w:t>
+      </w:r>
+      <w:r>
+        <w:rPr>
+          <w:rFonts w:ascii="方正仿宋_GB2312" w:eastAsia="方正仿宋_GB2312" w:hAnsi="方正仿宋_GB2312" w:cs="方正仿宋_GB2312"/>
+          <w:sz w:val="32"/>
+          <w:szCs w:val="32"/>
+        </w:rPr>
+        <w:t>10月8日，</w:t>
+      </w:r>
+      <w:r>
+        <w:rPr>
+          <w:rFonts w:ascii="宋体" w:eastAsia="宋体" w:hAnsi="宋体" w:cs="宋体" w:hint="eastAsia"/>
+          <w:sz w:val="32"/>
+          <w:szCs w:val="32"/>
+        </w:rPr>
+        <w:t>已完成</w:t>
+      </w:r>
+      <w:r>
+        <w:rPr>
+          <w:rFonts w:ascii="___WRD_EMBED_SUB_44" w:eastAsia="___WRD_EMBED_SUB_44" w:hAnsi="___WRD_EMBED_SUB_44" w:cs="___WRD_EMBED_SUB_44" w:hint="eastAsia"/>
+          <w:sz w:val="32"/>
+          <w:szCs w:val="32"/>
+        </w:rPr>
+        <w:t>报名确</w:t>
       </w:r>
       <w:r>
         <w:rPr>
@@ -1258,19 +1629,623 @@
           <w:sz w:val="32"/>
           <w:szCs w:val="32"/>
         </w:rPr>
-        <w:t>：</w:t>
-      </w:r>
-      <w:r>
-        <w:rPr>
-          <w:rFonts w:ascii="方正仿宋_GB2312" w:eastAsia="方正仿宋_GB2312" w:hAnsi="方正仿宋_GB2312" w:cs="方正仿宋_GB2312"/>
-          <w:sz w:val="32"/>
-          <w:szCs w:val="32"/>
-        </w:rPr>
-        <w:t>2026年7月1日</w:t>
-      </w:r>
-      <w:r>
-        <w:rPr>
-          <w:rFonts w:ascii="宋体" w:eastAsia="宋体" w:hAnsi="宋体" w:cs="宋体" w:hint="eastAsia"/>
+        <w:t>的项目</w:t>
+      </w:r>
+      <w:r>
+        <w:rPr>
+          <w:rFonts w:ascii="宋体" w:eastAsia="宋体" w:hAnsi="宋体" w:cs="宋体" w:hint="eastAsia"/>
+          <w:sz w:val="32"/>
+          <w:szCs w:val="32"/>
+        </w:rPr>
+        <w:t>可继</w:t>
+      </w:r>
+      <w:r>
+        <w:rPr>
+          <w:rFonts w:ascii="___WRD_EMBED_SUB_44" w:eastAsia="___WRD_EMBED_SUB_44" w:hAnsi="___WRD_EMBED_SUB_44" w:cs="___WRD_EMBED_SUB_44" w:hint="eastAsia"/>
+          <w:sz w:val="32"/>
+          <w:szCs w:val="32"/>
+        </w:rPr>
+        <w:t>续</w:t>
+      </w:r>
+      <w:r>
+        <w:rPr>
+          <w:rFonts w:ascii="宋体" w:eastAsia="宋体" w:hAnsi="宋体" w:cs="宋体" w:hint="eastAsia"/>
+          <w:sz w:val="32"/>
+          <w:szCs w:val="32"/>
+        </w:rPr>
+        <w:t>完善并</w:t>
+      </w:r>
+      <w:r>
+        <w:rPr>
+          <w:rFonts w:ascii="___WRD_EMBED_SUB_44" w:eastAsia="___WRD_EMBED_SUB_44" w:hAnsi="___WRD_EMBED_SUB_44" w:cs="___WRD_EMBED_SUB_44" w:hint="eastAsia"/>
+          <w:sz w:val="32"/>
+          <w:szCs w:val="32"/>
+        </w:rPr>
+        <w:t>提交</w:t>
+      </w:r>
+      <w:r>
+        <w:rPr>
+          <w:rFonts w:ascii="宋体" w:eastAsia="宋体" w:hAnsi="宋体" w:cs="宋体" w:hint="eastAsia"/>
+          <w:sz w:val="32"/>
+          <w:szCs w:val="32"/>
+        </w:rPr>
+        <w:t>初</w:t>
+      </w:r>
+      <w:r>
+        <w:rPr>
+          <w:rFonts w:ascii="___WRD_EMBED_SUB_44" w:eastAsia="___WRD_EMBED_SUB_44" w:hAnsi="___WRD_EMBED_SUB_44" w:cs="___WRD_EMBED_SUB_44" w:hint="eastAsia"/>
+          <w:sz w:val="32"/>
+          <w:szCs w:val="32"/>
+        </w:rPr>
+        <w:t>赛材料，全部</w:t>
+      </w:r>
+      <w:r>
+        <w:rPr>
+          <w:rFonts w:ascii="宋体" w:eastAsia="宋体" w:hAnsi="宋体" w:cs="宋体" w:hint="eastAsia"/>
+          <w:sz w:val="32"/>
+          <w:szCs w:val="32"/>
+        </w:rPr>
+        <w:t>必</w:t>
+      </w:r>
+      <w:r>
+        <w:rPr>
+          <w:rFonts w:ascii="___WRD_EMBED_SUB_44" w:eastAsia="___WRD_EMBED_SUB_44" w:hAnsi="___WRD_EMBED_SUB_44" w:cs="___WRD_EMBED_SUB_44" w:hint="eastAsia"/>
+          <w:sz w:val="32"/>
+          <w:szCs w:val="32"/>
+        </w:rPr>
+        <w:t>交材料</w:t>
+      </w:r>
+      <w:r>
+        <w:rPr>
+          <w:rFonts w:ascii="宋体" w:eastAsia="宋体" w:hAnsi="宋体" w:cs="宋体" w:hint="eastAsia"/>
+          <w:sz w:val="32"/>
+          <w:szCs w:val="32"/>
+        </w:rPr>
+        <w:t>于</w:t>
+      </w:r>
+      <w:r>
+        <w:rPr>
+          <w:rFonts w:ascii="方正仿宋_GB2312" w:eastAsia="方正仿宋_GB2312" w:hAnsi="方正仿宋_GB2312" w:cs="方正仿宋_GB2312"/>
+          <w:sz w:val="32"/>
+          <w:szCs w:val="32"/>
+        </w:rPr>
+        <w:t>10月8日</w:t>
+      </w:r>
+      <w:r>
+        <w:rPr>
+          <w:rFonts w:ascii="宋体" w:eastAsia="宋体" w:hAnsi="宋体" w:cs="宋体" w:hint="eastAsia"/>
+          <w:sz w:val="32"/>
+          <w:szCs w:val="32"/>
+        </w:rPr>
+        <w:t>截止</w:t>
+      </w:r>
+      <w:r>
+        <w:rPr>
+          <w:rFonts w:ascii="___WRD_EMBED_SUB_44" w:eastAsia="___WRD_EMBED_SUB_44" w:hAnsi="___WRD_EMBED_SUB_44" w:cs="___WRD_EMBED_SUB_44" w:hint="eastAsia"/>
+          <w:sz w:val="32"/>
+          <w:szCs w:val="32"/>
+        </w:rPr>
+        <w:t>提交，具体时</w:t>
+      </w:r>
+      <w:r>
+        <w:rPr>
+          <w:rFonts w:ascii="宋体" w:eastAsia="宋体" w:hAnsi="宋体" w:cs="宋体" w:hint="eastAsia"/>
+          <w:sz w:val="32"/>
+          <w:szCs w:val="32"/>
+        </w:rPr>
+        <w:t>点以</w:t>
+      </w:r>
+      <w:r>
+        <w:rPr>
+          <w:rFonts w:ascii="___WRD_EMBED_SUB_44" w:eastAsia="___WRD_EMBED_SUB_44" w:hAnsi="___WRD_EMBED_SUB_44" w:cs="___WRD_EMBED_SUB_44" w:hint="eastAsia"/>
+          <w:sz w:val="32"/>
+          <w:szCs w:val="32"/>
+        </w:rPr>
+        <w:t>报名系统</w:t>
+      </w:r>
+      <w:r>
+        <w:rPr>
+          <w:rFonts w:ascii="宋体" w:eastAsia="宋体" w:hAnsi="宋体" w:cs="宋体" w:hint="eastAsia"/>
+          <w:sz w:val="32"/>
+          <w:szCs w:val="32"/>
+        </w:rPr>
+        <w:t>或</w:t>
+      </w:r>
+      <w:r>
+        <w:rPr>
+          <w:rFonts w:ascii="___WRD_EMBED_SUB_44" w:eastAsia="___WRD_EMBED_SUB_44" w:hAnsi="___WRD_EMBED_SUB_44" w:cs="___WRD_EMBED_SUB_44" w:hint="eastAsia"/>
+          <w:sz w:val="32"/>
+          <w:szCs w:val="32"/>
+        </w:rPr>
+        <w:t>组委会</w:t>
+      </w:r>
+      <w:r>
+        <w:rPr>
+          <w:rFonts w:ascii="宋体" w:eastAsia="宋体" w:hAnsi="宋体" w:cs="宋体" w:hint="eastAsia"/>
+          <w:sz w:val="32"/>
+          <w:szCs w:val="32"/>
+        </w:rPr>
+        <w:t>通</w:t>
+      </w:r>
+      <w:r>
+        <w:rPr>
+          <w:rFonts w:ascii="___WRD_EMBED_SUB_44" w:eastAsia="___WRD_EMBED_SUB_44" w:hAnsi="___WRD_EMBED_SUB_44" w:cs="___WRD_EMBED_SUB_44" w:hint="eastAsia"/>
+          <w:sz w:val="32"/>
+          <w:szCs w:val="32"/>
+        </w:rPr>
+        <w:t>知为准。工</w:t>
+      </w:r>
+      <w:r>
+        <w:rPr>
+          <w:rFonts w:ascii="宋体" w:eastAsia="宋体" w:hAnsi="宋体" w:cs="宋体" w:hint="eastAsia"/>
+          <w:sz w:val="32"/>
+          <w:szCs w:val="32"/>
+        </w:rPr>
+        <w:t>作</w:t>
+      </w:r>
+      <w:r>
+        <w:rPr>
+          <w:rFonts w:ascii="___WRD_EMBED_SUB_44" w:eastAsia="___WRD_EMBED_SUB_44" w:hAnsi="___WRD_EMBED_SUB_44" w:cs="___WRD_EMBED_SUB_44" w:hint="eastAsia"/>
+          <w:sz w:val="32"/>
+          <w:szCs w:val="32"/>
+        </w:rPr>
+        <w:t>人</w:t>
+      </w:r>
+      <w:r>
+        <w:rPr>
+          <w:rFonts w:ascii="宋体" w:eastAsia="宋体" w:hAnsi="宋体" w:cs="宋体" w:hint="eastAsia"/>
+          <w:sz w:val="32"/>
+          <w:szCs w:val="32"/>
+        </w:rPr>
+        <w:t>员</w:t>
+      </w:r>
+      <w:r>
+        <w:rPr>
+          <w:rFonts w:ascii="___WRD_EMBED_SUB_44" w:eastAsia="___WRD_EMBED_SUB_44" w:hAnsi="___WRD_EMBED_SUB_44" w:cs="___WRD_EMBED_SUB_44" w:hint="eastAsia"/>
+          <w:sz w:val="32"/>
+          <w:szCs w:val="32"/>
+        </w:rPr>
+        <w:t>同步开展材料</w:t>
+      </w:r>
+      <w:r>
+        <w:rPr>
+          <w:rFonts w:ascii="宋体" w:eastAsia="宋体" w:hAnsi="宋体" w:cs="宋体" w:hint="eastAsia"/>
+          <w:sz w:val="32"/>
+          <w:szCs w:val="32"/>
+        </w:rPr>
+        <w:t>完整</w:t>
+      </w:r>
+      <w:r>
+        <w:rPr>
+          <w:rFonts w:ascii="___WRD_EMBED_SUB_44" w:eastAsia="___WRD_EMBED_SUB_44" w:hAnsi="___WRD_EMBED_SUB_44" w:cs="___WRD_EMBED_SUB_44" w:hint="eastAsia"/>
+          <w:sz w:val="32"/>
+          <w:szCs w:val="32"/>
+        </w:rPr>
+        <w:t>性、资格</w:t>
+      </w:r>
+      <w:r>
+        <w:rPr>
+          <w:rFonts w:ascii="宋体" w:eastAsia="宋体" w:hAnsi="宋体" w:cs="宋体" w:hint="eastAsia"/>
+          <w:sz w:val="32"/>
+          <w:szCs w:val="32"/>
+        </w:rPr>
+        <w:t>符</w:t>
+      </w:r>
+      <w:r>
+        <w:rPr>
+          <w:rFonts w:ascii="___WRD_EMBED_SUB_44" w:eastAsia="___WRD_EMBED_SUB_44" w:hAnsi="___WRD_EMBED_SUB_44" w:cs="___WRD_EMBED_SUB_44" w:hint="eastAsia"/>
+          <w:sz w:val="32"/>
+          <w:szCs w:val="32"/>
+        </w:rPr>
+        <w:t>合性、赛道适</w:t>
+      </w:r>
+      <w:r>
+        <w:rPr>
+          <w:rFonts w:ascii="宋体" w:eastAsia="宋体" w:hAnsi="宋体" w:cs="宋体" w:hint="eastAsia"/>
+          <w:sz w:val="32"/>
+          <w:szCs w:val="32"/>
+        </w:rPr>
+        <w:t>配</w:t>
+      </w:r>
+      <w:r>
+        <w:rPr>
+          <w:rFonts w:ascii="___WRD_EMBED_SUB_44" w:eastAsia="___WRD_EMBED_SUB_44" w:hAnsi="___WRD_EMBED_SUB_44" w:cs="___WRD_EMBED_SUB_44" w:hint="eastAsia"/>
+          <w:sz w:val="32"/>
+          <w:szCs w:val="32"/>
+        </w:rPr>
+        <w:t>性和基础合规审</w:t>
+      </w:r>
+      <w:r>
+        <w:rPr>
+          <w:rFonts w:ascii="宋体" w:eastAsia="宋体" w:hAnsi="宋体" w:cs="宋体" w:hint="eastAsia"/>
+          <w:sz w:val="32"/>
+          <w:szCs w:val="32"/>
+        </w:rPr>
+        <w:t>查</w:t>
+      </w:r>
+      <w:r>
+        <w:rPr>
+          <w:rFonts w:ascii="___WRD_EMBED_SUB_44" w:eastAsia="___WRD_EMBED_SUB_44" w:hAnsi="___WRD_EMBED_SUB_44" w:cs="___WRD_EMBED_SUB_44" w:hint="eastAsia"/>
+          <w:sz w:val="32"/>
+          <w:szCs w:val="32"/>
+        </w:rPr>
+        <w:t>。</w:t>
+      </w:r>
+    </w:p>
+    <w:p>
+      <w:pPr>
+        <w:ind w:firstLineChars="200" w:firstLine="640"/>
+        <w:jc w:val="left"/>
+        <w:rPr>
+          <w:rFonts w:ascii="方正仿宋_GB2312" w:eastAsia="方正仿宋_GB2312" w:hAnsi="方正仿宋_GB2312" w:cs="方正仿宋_GB2312"/>
+          <w:sz w:val="32"/>
+          <w:szCs w:val="32"/>
+        </w:rPr>
+      </w:pPr>
+      <w:r>
+        <w:rPr>
+          <w:rFonts w:ascii="方正仿宋_GB2312" w:eastAsia="方正仿宋_GB2312" w:hAnsi="方正仿宋_GB2312" w:cs="方正仿宋_GB2312" w:hint="eastAsia"/>
+          <w:sz w:val="32"/>
+          <w:szCs w:val="32"/>
+        </w:rPr>
+        <w:t>（</w:t>
+      </w:r>
+      <w:r>
+        <w:rPr>
+          <w:rFonts w:ascii="方正仿宋_GB2312" w:eastAsia="方正仿宋_GB2312" w:hAnsi="方正仿宋_GB2312" w:cs="方正仿宋_GB2312" w:hint="eastAsia"/>
+          <w:sz w:val="32"/>
+          <w:szCs w:val="32"/>
+        </w:rPr>
+        <w:t>4</w:t>
+      </w:r>
+      <w:r>
+        <w:rPr>
+          <w:rFonts w:ascii="方正仿宋_GB2312" w:eastAsia="方正仿宋_GB2312" w:hAnsi="方正仿宋_GB2312" w:cs="方正仿宋_GB2312" w:hint="eastAsia"/>
+          <w:sz w:val="32"/>
+          <w:szCs w:val="32"/>
+        </w:rPr>
+        <w:t>）初赛评审与入围确认：</w:t>
+      </w:r>
+      <w:r>
+        <w:rPr>
+          <w:rFonts w:ascii="方正仿宋_GB2312" w:eastAsia="方正仿宋_GB2312" w:hAnsi="方正仿宋_GB2312" w:cs="方正仿宋_GB2312" w:hint="eastAsia"/>
+          <w:sz w:val="32"/>
+          <w:szCs w:val="32"/>
+        </w:rPr>
+        <w:t>2026</w:t>
+      </w:r>
+      <w:r>
+        <w:rPr>
+          <w:rFonts w:ascii="方正仿宋_GB2312" w:eastAsia="方正仿宋_GB2312" w:hAnsi="方正仿宋_GB2312" w:cs="方正仿宋_GB2312" w:hint="eastAsia"/>
+          <w:sz w:val="32"/>
+          <w:szCs w:val="32"/>
+        </w:rPr>
+        <w:t>年</w:t>
+      </w:r>
+      <w:r>
+        <w:rPr>
+          <w:rFonts w:ascii="方正仿宋_GB2312" w:eastAsia="方正仿宋_GB2312" w:hAnsi="方正仿宋_GB2312" w:cs="方正仿宋_GB2312" w:hint="eastAsia"/>
+          <w:sz w:val="32"/>
+          <w:szCs w:val="32"/>
+        </w:rPr>
+        <w:t>10</w:t>
+      </w:r>
+      <w:r>
+        <w:rPr>
+          <w:rFonts w:ascii="方正仿宋_GB2312" w:eastAsia="方正仿宋_GB2312" w:hAnsi="方正仿宋_GB2312" w:cs="方正仿宋_GB2312" w:hint="eastAsia"/>
+          <w:sz w:val="32"/>
+          <w:szCs w:val="32"/>
+        </w:rPr>
+        <w:t>月</w:t>
+      </w:r>
+      <w:r>
+        <w:rPr>
+          <w:rFonts w:ascii="方正仿宋_GB2312" w:eastAsia="方正仿宋_GB2312" w:hAnsi="方正仿宋_GB2312" w:cs="方正仿宋_GB2312" w:hint="eastAsia"/>
+          <w:sz w:val="32"/>
+          <w:szCs w:val="32"/>
+        </w:rPr>
+        <w:t>9</w:t>
+      </w:r>
+      <w:r>
+        <w:rPr>
+          <w:rFonts w:ascii="方正仿宋_GB2312" w:eastAsia="方正仿宋_GB2312" w:hAnsi="方正仿宋_GB2312" w:cs="方正仿宋_GB2312" w:hint="eastAsia"/>
+          <w:sz w:val="32"/>
+          <w:szCs w:val="32"/>
+        </w:rPr>
+        <w:t>日至</w:t>
+      </w:r>
+      <w:r>
+        <w:rPr>
+          <w:rFonts w:ascii="方正仿宋_GB2312" w:eastAsia="方正仿宋_GB2312" w:hAnsi="方正仿宋_GB2312" w:cs="方正仿宋_GB2312" w:hint="eastAsia"/>
+          <w:sz w:val="32"/>
+          <w:szCs w:val="32"/>
+        </w:rPr>
+        <w:t>10</w:t>
+      </w:r>
+      <w:r>
+        <w:rPr>
+          <w:rFonts w:ascii="方正仿宋_GB2312" w:eastAsia="方正仿宋_GB2312" w:hAnsi="方正仿宋_GB2312" w:cs="方正仿宋_GB2312" w:hint="eastAsia"/>
+          <w:sz w:val="32"/>
+          <w:szCs w:val="32"/>
+        </w:rPr>
+        <w:t>月</w:t>
+      </w:r>
+      <w:r>
+        <w:rPr>
+          <w:rFonts w:ascii="方正仿宋_GB2312" w:eastAsia="方正仿宋_GB2312" w:hAnsi="方正仿宋_GB2312" w:cs="方正仿宋_GB2312" w:hint="eastAsia"/>
+          <w:sz w:val="32"/>
+          <w:szCs w:val="32"/>
+        </w:rPr>
+        <w:t>13</w:t>
+      </w:r>
+      <w:r>
+        <w:rPr>
+          <w:rFonts w:ascii="方正仿宋_GB2312" w:eastAsia="方正仿宋_GB2312" w:hAnsi="方正仿宋_GB2312" w:cs="方正仿宋_GB2312" w:hint="eastAsia"/>
+          <w:sz w:val="32"/>
+          <w:szCs w:val="32"/>
+        </w:rPr>
+        <w:t>日组织线上材料评审，对初赛晋级项目进行线上陈述或问答，综合确定拟入围决赛项目。</w:t>
+      </w:r>
+    </w:p>
+    <w:p>
+      <w:pPr>
+        <w:ind w:firstLineChars="200" w:firstLine="640"/>
+        <w:jc w:val="left"/>
+        <w:rPr>
+          <w:rFonts w:ascii="方正仿宋_GB2312" w:eastAsia="方正仿宋_GB2312" w:hAnsi="方正仿宋_GB2312" w:cs="方正仿宋_GB2312"/>
+          <w:sz w:val="32"/>
+          <w:szCs w:val="32"/>
+        </w:rPr>
+      </w:pPr>
+      <w:r>
+        <w:rPr>
+          <w:rFonts w:ascii="方正仿宋_GB2312" w:eastAsia="方正仿宋_GB2312" w:hAnsi="方正仿宋_GB2312" w:cs="方正仿宋_GB2312" w:hint="eastAsia"/>
+          <w:sz w:val="32"/>
+          <w:szCs w:val="32"/>
+        </w:rPr>
+        <w:t>（</w:t>
+      </w:r>
+      <w:r>
+        <w:rPr>
+          <w:rFonts w:ascii="方正仿宋_GB2312" w:eastAsia="方正仿宋_GB2312" w:hAnsi="方正仿宋_GB2312" w:cs="方正仿宋_GB2312" w:hint="eastAsia"/>
+          <w:sz w:val="32"/>
+          <w:szCs w:val="32"/>
+        </w:rPr>
+        <w:t>5</w:t>
+      </w:r>
+      <w:r>
+        <w:rPr>
+          <w:rFonts w:ascii="方正仿宋_GB2312" w:eastAsia="方正仿宋_GB2312" w:hAnsi="方正仿宋_GB2312" w:cs="方正仿宋_GB2312" w:hint="eastAsia"/>
+          <w:sz w:val="32"/>
+          <w:szCs w:val="32"/>
+        </w:rPr>
+        <w:t>）项目打磨与决赛材料复核：</w:t>
+      </w:r>
+      <w:r>
+        <w:rPr>
+          <w:rFonts w:ascii="方正仿宋_GB2312" w:eastAsia="方正仿宋_GB2312" w:hAnsi="方正仿宋_GB2312" w:cs="方正仿宋_GB2312" w:hint="eastAsia"/>
+          <w:sz w:val="32"/>
+          <w:szCs w:val="32"/>
+        </w:rPr>
+        <w:t>2026</w:t>
+      </w:r>
+      <w:r>
+        <w:rPr>
+          <w:rFonts w:ascii="方正仿宋_GB2312" w:eastAsia="方正仿宋_GB2312" w:hAnsi="方正仿宋_GB2312" w:cs="方正仿宋_GB2312" w:hint="eastAsia"/>
+          <w:sz w:val="32"/>
+          <w:szCs w:val="32"/>
+        </w:rPr>
+        <w:t>年</w:t>
+      </w:r>
+      <w:r>
+        <w:rPr>
+          <w:rFonts w:ascii="方正仿宋_GB2312" w:eastAsia="方正仿宋_GB2312" w:hAnsi="方正仿宋_GB2312" w:cs="方正仿宋_GB2312" w:hint="eastAsia"/>
+          <w:sz w:val="32"/>
+          <w:szCs w:val="32"/>
+        </w:rPr>
+        <w:t>10</w:t>
+      </w:r>
+      <w:r>
+        <w:rPr>
+          <w:rFonts w:ascii="方正仿宋_GB2312" w:eastAsia="方正仿宋_GB2312" w:hAnsi="方正仿宋_GB2312" w:cs="方正仿宋_GB2312" w:hint="eastAsia"/>
+          <w:sz w:val="32"/>
+          <w:szCs w:val="32"/>
+        </w:rPr>
+        <w:t>月</w:t>
+      </w:r>
+      <w:r>
+        <w:rPr>
+          <w:rFonts w:ascii="方正仿宋_GB2312" w:eastAsia="方正仿宋_GB2312" w:hAnsi="方正仿宋_GB2312" w:cs="方正仿宋_GB2312" w:hint="eastAsia"/>
+          <w:sz w:val="32"/>
+          <w:szCs w:val="32"/>
+        </w:rPr>
+        <w:t>13</w:t>
+      </w:r>
+      <w:r>
+        <w:rPr>
+          <w:rFonts w:ascii="方正仿宋_GB2312" w:eastAsia="方正仿宋_GB2312" w:hAnsi="方正仿宋_GB2312" w:cs="方正仿宋_GB2312" w:hint="eastAsia"/>
+          <w:sz w:val="32"/>
+          <w:szCs w:val="32"/>
+        </w:rPr>
+        <w:t>日至</w:t>
+      </w:r>
+      <w:r>
+        <w:rPr>
+          <w:rFonts w:ascii="方正仿宋_GB2312" w:eastAsia="方正仿宋_GB2312" w:hAnsi="方正仿宋_GB2312" w:cs="方正仿宋_GB2312" w:hint="eastAsia"/>
+          <w:sz w:val="32"/>
+          <w:szCs w:val="32"/>
+        </w:rPr>
+        <w:t>10</w:t>
+      </w:r>
+      <w:r>
+        <w:rPr>
+          <w:rFonts w:ascii="方正仿宋_GB2312" w:eastAsia="方正仿宋_GB2312" w:hAnsi="方正仿宋_GB2312" w:cs="方正仿宋_GB2312" w:hint="eastAsia"/>
+          <w:sz w:val="32"/>
+          <w:szCs w:val="32"/>
+        </w:rPr>
+        <w:t>月</w:t>
+      </w:r>
+      <w:r>
+        <w:rPr>
+          <w:rFonts w:ascii="方正仿宋_GB2312" w:eastAsia="方正仿宋_GB2312" w:hAnsi="方正仿宋_GB2312" w:cs="方正仿宋_GB2312" w:hint="eastAsia"/>
+          <w:sz w:val="32"/>
+          <w:szCs w:val="32"/>
+        </w:rPr>
+        <w:t>18</w:t>
+      </w:r>
+      <w:r>
+        <w:rPr>
+          <w:rFonts w:ascii="方正仿宋_GB2312" w:eastAsia="方正仿宋_GB2312" w:hAnsi="方正仿宋_GB2312" w:cs="方正仿宋_GB2312" w:hint="eastAsia"/>
+          <w:sz w:val="32"/>
+          <w:szCs w:val="32"/>
+        </w:rPr>
+        <w:t>日组织入围项目开展展示内容打磨、路演材料完善和演示准备，并对真实性、知识产权、团队成员身份、项目成果及相关证明材料进行复核。</w:t>
+      </w:r>
+    </w:p>
+    <w:p>
+      <w:pPr>
+        <w:ind w:firstLineChars="200" w:firstLine="640"/>
+        <w:jc w:val="left"/>
+        <w:rPr>
+          <w:rFonts w:ascii="方正仿宋_GB2312" w:eastAsia="方正仿宋_GB2312" w:hAnsi="方正仿宋_GB2312" w:cs="方正仿宋_GB2312"/>
+          <w:sz w:val="32"/>
+          <w:szCs w:val="32"/>
+        </w:rPr>
+      </w:pPr>
+      <w:r>
+        <w:rPr>
+          <w:rFonts w:ascii="方正仿宋_GB2312" w:eastAsia="方正仿宋_GB2312" w:hAnsi="方正仿宋_GB2312" w:cs="方正仿宋_GB2312" w:hint="eastAsia"/>
+          <w:sz w:val="32"/>
+          <w:szCs w:val="32"/>
+        </w:rPr>
+        <w:t>（</w:t>
+      </w:r>
+      <w:r>
+        <w:rPr>
+          <w:rFonts w:ascii="方正仿宋_GB2312" w:eastAsia="方正仿宋_GB2312" w:hAnsi="方正仿宋_GB2312" w:cs="方正仿宋_GB2312" w:hint="eastAsia"/>
+          <w:sz w:val="32"/>
+          <w:szCs w:val="32"/>
+        </w:rPr>
+        <w:t>6</w:t>
+      </w:r>
+      <w:r>
+        <w:rPr>
+          <w:rFonts w:ascii="方正仿宋_GB2312" w:eastAsia="方正仿宋_GB2312" w:hAnsi="方正仿宋_GB2312" w:cs="方正仿宋_GB2312" w:hint="eastAsia"/>
+          <w:sz w:val="32"/>
+          <w:szCs w:val="32"/>
+        </w:rPr>
+        <w:t>）线下决赛与成果展示：</w:t>
+      </w:r>
+      <w:r>
+        <w:rPr>
+          <w:rFonts w:ascii="方正仿宋_GB2312" w:eastAsia="方正仿宋_GB2312" w:hAnsi="方正仿宋_GB2312" w:cs="方正仿宋_GB2312" w:hint="eastAsia"/>
+          <w:sz w:val="32"/>
+          <w:szCs w:val="32"/>
+        </w:rPr>
+        <w:t>2026</w:t>
+      </w:r>
+      <w:r>
+        <w:rPr>
+          <w:rFonts w:ascii="方正仿宋_GB2312" w:eastAsia="方正仿宋_GB2312" w:hAnsi="方正仿宋_GB2312" w:cs="方正仿宋_GB2312" w:hint="eastAsia"/>
+          <w:sz w:val="32"/>
+          <w:szCs w:val="32"/>
+        </w:rPr>
+        <w:t>年</w:t>
+      </w:r>
+      <w:r>
+        <w:rPr>
+          <w:rFonts w:ascii="方正仿宋_GB2312" w:eastAsia="方正仿宋_GB2312" w:hAnsi="方正仿宋_GB2312" w:cs="方正仿宋_GB2312" w:hint="eastAsia"/>
+          <w:sz w:val="32"/>
+          <w:szCs w:val="32"/>
+        </w:rPr>
+        <w:t>10</w:t>
+      </w:r>
+      <w:r>
+        <w:rPr>
+          <w:rFonts w:ascii="方正仿宋_GB2312" w:eastAsia="方正仿宋_GB2312" w:hAnsi="方正仿宋_GB2312" w:cs="方正仿宋_GB2312" w:hint="eastAsia"/>
+          <w:sz w:val="32"/>
+          <w:szCs w:val="32"/>
+        </w:rPr>
+        <w:t>月</w:t>
+      </w:r>
+      <w:r>
+        <w:rPr>
+          <w:rFonts w:ascii="方正仿宋_GB2312" w:eastAsia="方正仿宋_GB2312" w:hAnsi="方正仿宋_GB2312" w:cs="方正仿宋_GB2312" w:hint="eastAsia"/>
+          <w:sz w:val="32"/>
+          <w:szCs w:val="32"/>
+        </w:rPr>
+        <w:t>18</w:t>
+      </w:r>
+      <w:r>
+        <w:rPr>
+          <w:rFonts w:ascii="方正仿宋_GB2312" w:eastAsia="方正仿宋_GB2312" w:hAnsi="方正仿宋_GB2312" w:cs="方正仿宋_GB2312" w:hint="eastAsia"/>
+          <w:sz w:val="32"/>
+          <w:szCs w:val="32"/>
+        </w:rPr>
+        <w:t>日至</w:t>
+      </w:r>
+      <w:r>
+        <w:rPr>
+          <w:rFonts w:ascii="方正仿宋_GB2312" w:eastAsia="方正仿宋_GB2312" w:hAnsi="方正仿宋_GB2312" w:cs="方正仿宋_GB2312" w:hint="eastAsia"/>
+          <w:sz w:val="32"/>
+          <w:szCs w:val="32"/>
+        </w:rPr>
+        <w:t>10</w:t>
+      </w:r>
+      <w:r>
+        <w:rPr>
+          <w:rFonts w:ascii="方正仿宋_GB2312" w:eastAsia="方正仿宋_GB2312" w:hAnsi="方正仿宋_GB2312" w:cs="方正仿宋_GB2312" w:hint="eastAsia"/>
+          <w:sz w:val="32"/>
+          <w:szCs w:val="32"/>
+        </w:rPr>
+        <w:t>月</w:t>
+      </w:r>
+      <w:r>
+        <w:rPr>
+          <w:rFonts w:ascii="方正仿宋_GB2312" w:eastAsia="方正仿宋_GB2312" w:hAnsi="方正仿宋_GB2312" w:cs="方正仿宋_GB2312" w:hint="eastAsia"/>
+          <w:sz w:val="32"/>
+          <w:szCs w:val="32"/>
+        </w:rPr>
+        <w:t>31</w:t>
+      </w:r>
+      <w:r>
+        <w:rPr>
+          <w:rFonts w:ascii="方正仿宋_GB2312" w:eastAsia="方正仿宋_GB2312" w:hAnsi="方正仿宋_GB2312" w:cs="方正仿宋_GB2312" w:hint="eastAsia"/>
+          <w:sz w:val="32"/>
+          <w:szCs w:val="32"/>
+        </w:rPr>
+        <w:t>日组织线下路演答辩、项目展示、结果确认和资源对接活动。</w:t>
+      </w:r>
+    </w:p>
+    <w:p>
+      <w:pPr>
+        <w:ind w:firstLineChars="200" w:firstLine="640"/>
+        <w:jc w:val="left"/>
+        <w:rPr>
+          <w:rFonts w:ascii="方正仿宋_GB2312" w:eastAsia="方正仿宋_GB2312" w:hAnsi="方正仿宋_GB2312" w:cs="方正仿宋_GB2312"/>
+          <w:sz w:val="32"/>
+          <w:szCs w:val="32"/>
+        </w:rPr>
+      </w:pPr>
+      <w:r>
+        <w:rPr>
+          <w:rFonts w:ascii="方正仿宋_GB2312" w:eastAsia="方正仿宋_GB2312" w:hAnsi="方正仿宋_GB2312" w:cs="方正仿宋_GB2312" w:hint="eastAsia"/>
+          <w:sz w:val="32"/>
+          <w:szCs w:val="32"/>
+        </w:rPr>
+        <w:t>线下决赛采取“</w:t>
+      </w:r>
+      <w:r>
+        <w:rPr>
+          <w:rFonts w:ascii="方正仿宋_GB2312" w:eastAsia="方正仿宋_GB2312" w:hAnsi="方正仿宋_GB2312" w:cs="方正仿宋_GB2312" w:hint="eastAsia"/>
+          <w:sz w:val="32"/>
+          <w:szCs w:val="32"/>
+        </w:rPr>
+        <w:t>6</w:t>
+      </w:r>
+      <w:r>
+        <w:rPr>
+          <w:rFonts w:ascii="方正仿宋_GB2312" w:eastAsia="方正仿宋_GB2312" w:hAnsi="方正仿宋_GB2312" w:cs="方正仿宋_GB2312" w:hint="eastAsia"/>
           <w:sz w:val="32"/>
           <w:szCs w:val="32"/>
         </w:rPr>
@@ -1278,243 +2253,69 @@
       </w:r>
       <w:r>
         <w:rPr>
-          <w:rFonts w:ascii="方正仿宋_GB2312" w:eastAsia="方正仿宋_GB2312" w:hAnsi="方正仿宋_GB2312" w:cs="方正仿宋_GB2312"/>
-          <w:sz w:val="32"/>
-          <w:szCs w:val="32"/>
-        </w:rPr>
-        <w:t>9月30日</w:t>
-      </w:r>
-      <w:r>
-        <w:rPr>
-          <w:rFonts w:ascii="宋体" w:eastAsia="宋体" w:hAnsi="宋体" w:cs="宋体" w:hint="eastAsia"/>
-          <w:sz w:val="32"/>
-          <w:szCs w:val="32"/>
-        </w:rPr>
-        <w:t>受理</w:t>
-      </w:r>
-      <w:r>
-        <w:rPr>
-          <w:rFonts w:ascii="___WRD_EMBED_SUB_44" w:eastAsia="___WRD_EMBED_SUB_44" w:hAnsi="___WRD_EMBED_SUB_44" w:cs="___WRD_EMBED_SUB_44" w:hint="eastAsia"/>
-          <w:sz w:val="32"/>
-          <w:szCs w:val="32"/>
-        </w:rPr>
-        <w:t>项目报名。参赛团队应在</w:t>
-      </w:r>
-      <w:r>
-        <w:rPr>
-          <w:rFonts w:ascii="方正仿宋_GB2312" w:eastAsia="方正仿宋_GB2312" w:hAnsi="方正仿宋_GB2312" w:cs="方正仿宋_GB2312"/>
-          <w:sz w:val="32"/>
-          <w:szCs w:val="32"/>
-        </w:rPr>
-        <w:t>9月30日前</w:t>
-      </w:r>
-      <w:r>
-        <w:rPr>
-          <w:rFonts w:ascii="宋体" w:eastAsia="宋体" w:hAnsi="宋体" w:cs="宋体" w:hint="eastAsia"/>
-          <w:sz w:val="32"/>
-          <w:szCs w:val="32"/>
-        </w:rPr>
-        <w:t>完成</w:t>
-      </w:r>
-      <w:r>
-        <w:rPr>
-          <w:rFonts w:ascii="___WRD_EMBED_SUB_44" w:eastAsia="___WRD_EMBED_SUB_44" w:hAnsi="___WRD_EMBED_SUB_44" w:cs="___WRD_EMBED_SUB_44" w:hint="eastAsia"/>
-          <w:sz w:val="32"/>
-          <w:szCs w:val="32"/>
-        </w:rPr>
-        <w:t>报名系统</w:t>
-      </w:r>
-      <w:r>
-        <w:rPr>
-          <w:rFonts w:ascii="宋体" w:eastAsia="宋体" w:hAnsi="宋体" w:cs="宋体" w:hint="eastAsia"/>
-          <w:sz w:val="32"/>
-          <w:szCs w:val="32"/>
-        </w:rPr>
-        <w:t>信息填</w:t>
-      </w:r>
-      <w:r>
-        <w:rPr>
-          <w:rFonts w:ascii="___WRD_EMBED_SUB_44" w:eastAsia="___WRD_EMBED_SUB_44" w:hAnsi="___WRD_EMBED_SUB_44" w:cs="___WRD_EMBED_SUB_44" w:hint="eastAsia"/>
-          <w:sz w:val="32"/>
-          <w:szCs w:val="32"/>
-        </w:rPr>
-        <w:t>报及</w:t>
-      </w:r>
-      <w:r>
-        <w:rPr>
-          <w:rFonts w:ascii="宋体" w:eastAsia="宋体" w:hAnsi="宋体" w:cs="宋体" w:hint="eastAsia"/>
-          <w:sz w:val="32"/>
-          <w:szCs w:val="32"/>
-        </w:rPr>
-        <w:t>缴</w:t>
-      </w:r>
-      <w:r>
-        <w:rPr>
-          <w:rFonts w:ascii="___WRD_EMBED_SUB_44" w:eastAsia="___WRD_EMBED_SUB_44" w:hAnsi="___WRD_EMBED_SUB_44" w:cs="___WRD_EMBED_SUB_44" w:hint="eastAsia"/>
-          <w:sz w:val="32"/>
-          <w:szCs w:val="32"/>
-        </w:rPr>
-        <w:t>费</w:t>
-      </w:r>
-      <w:r>
-        <w:rPr>
-          <w:rFonts w:ascii="宋体" w:eastAsia="宋体" w:hAnsi="宋体" w:cs="宋体" w:hint="eastAsia"/>
-          <w:sz w:val="32"/>
-          <w:szCs w:val="32"/>
-        </w:rPr>
-        <w:t>；</w:t>
-      </w:r>
-      <w:r>
-        <w:rPr>
-          <w:rFonts w:ascii="___WRD_EMBED_SUB_44" w:eastAsia="___WRD_EMBED_SUB_44" w:hAnsi="___WRD_EMBED_SUB_44" w:cs="___WRD_EMBED_SUB_44" w:hint="eastAsia"/>
-          <w:sz w:val="32"/>
-          <w:szCs w:val="32"/>
-        </w:rPr>
-        <w:t>报名期间</w:t>
-      </w:r>
-      <w:r>
-        <w:rPr>
-          <w:rFonts w:ascii="宋体" w:eastAsia="宋体" w:hAnsi="宋体" w:cs="宋体" w:hint="eastAsia"/>
-          <w:sz w:val="32"/>
-          <w:szCs w:val="32"/>
-        </w:rPr>
-        <w:t>可</w:t>
-      </w:r>
-      <w:r>
-        <w:rPr>
-          <w:rFonts w:ascii="___WRD_EMBED_SUB_44" w:eastAsia="___WRD_EMBED_SUB_44" w:hAnsi="___WRD_EMBED_SUB_44" w:cs="___WRD_EMBED_SUB_44" w:hint="eastAsia"/>
-          <w:sz w:val="32"/>
-          <w:szCs w:val="32"/>
-        </w:rPr>
-        <w:t>同步提交项目报</w:t>
-      </w:r>
-      <w:r>
-        <w:rPr>
-          <w:rFonts w:ascii="宋体" w:eastAsia="宋体" w:hAnsi="宋体" w:cs="宋体" w:hint="eastAsia"/>
-          <w:sz w:val="32"/>
-          <w:szCs w:val="32"/>
-        </w:rPr>
-        <w:t>告书</w:t>
-      </w:r>
-      <w:r>
-        <w:rPr>
-          <w:rFonts w:ascii="___WRD_EMBED_SUB_44" w:eastAsia="___WRD_EMBED_SUB_44" w:hAnsi="___WRD_EMBED_SUB_44" w:cs="___WRD_EMBED_SUB_44" w:hint="eastAsia"/>
-          <w:sz w:val="32"/>
-          <w:szCs w:val="32"/>
-        </w:rPr>
-        <w:t>、</w:t>
-      </w:r>
-      <w:r>
-        <w:rPr>
-          <w:rFonts w:ascii="宋体" w:eastAsia="宋体" w:hAnsi="宋体" w:cs="宋体" w:hint="eastAsia"/>
-          <w:sz w:val="32"/>
-          <w:szCs w:val="32"/>
-        </w:rPr>
-        <w:t>路</w:t>
-      </w:r>
-      <w:r>
-        <w:rPr>
-          <w:rFonts w:ascii="___WRD_EMBED_SUB_44" w:eastAsia="___WRD_EMBED_SUB_44" w:hAnsi="___WRD_EMBED_SUB_44" w:cs="___WRD_EMBED_SUB_44" w:hint="eastAsia"/>
-          <w:sz w:val="32"/>
-          <w:szCs w:val="32"/>
-        </w:rPr>
-        <w:t>演演</w:t>
-      </w:r>
-      <w:r>
-        <w:rPr>
-          <w:rFonts w:ascii="宋体" w:eastAsia="宋体" w:hAnsi="宋体" w:cs="宋体" w:hint="eastAsia"/>
-          <w:sz w:val="32"/>
-          <w:szCs w:val="32"/>
-        </w:rPr>
-        <w:t>示</w:t>
-      </w:r>
-      <w:r>
-        <w:rPr>
-          <w:rFonts w:ascii="___WRD_EMBED_SUB_44" w:eastAsia="___WRD_EMBED_SUB_44" w:hAnsi="___WRD_EMBED_SUB_44" w:cs="___WRD_EMBED_SUB_44" w:hint="eastAsia"/>
-          <w:sz w:val="32"/>
-          <w:szCs w:val="32"/>
-        </w:rPr>
-        <w:t>文</w:t>
-      </w:r>
-      <w:r>
-        <w:rPr>
-          <w:rFonts w:ascii="宋体" w:eastAsia="宋体" w:hAnsi="宋体" w:cs="宋体" w:hint="eastAsia"/>
-          <w:sz w:val="32"/>
-          <w:szCs w:val="32"/>
-        </w:rPr>
-        <w:t>稿</w:t>
-      </w:r>
-      <w:r>
-        <w:rPr>
-          <w:rFonts w:ascii="___WRD_EMBED_SUB_44" w:eastAsia="___WRD_EMBED_SUB_44" w:hAnsi="___WRD_EMBED_SUB_44" w:cs="___WRD_EMBED_SUB_44" w:hint="eastAsia"/>
-          <w:sz w:val="32"/>
-          <w:szCs w:val="32"/>
-        </w:rPr>
-        <w:t>、团队</w:t>
-      </w:r>
-      <w:r>
-        <w:rPr>
-          <w:rFonts w:ascii="宋体" w:eastAsia="宋体" w:hAnsi="宋体" w:cs="宋体" w:hint="eastAsia"/>
-          <w:sz w:val="32"/>
-          <w:szCs w:val="32"/>
-        </w:rPr>
-        <w:t>信息表</w:t>
-      </w:r>
-      <w:r>
-        <w:rPr>
-          <w:rFonts w:ascii="___WRD_EMBED_SUB_44" w:eastAsia="___WRD_EMBED_SUB_44" w:hAnsi="___WRD_EMBED_SUB_44" w:cs="___WRD_EMBED_SUB_44" w:hint="eastAsia"/>
-          <w:sz w:val="32"/>
-          <w:szCs w:val="32"/>
-        </w:rPr>
-        <w:t>、真实性与知识产</w:t>
-      </w:r>
-      <w:r>
-        <w:rPr>
-          <w:rFonts w:ascii="宋体" w:eastAsia="宋体" w:hAnsi="宋体" w:cs="宋体" w:hint="eastAsia"/>
-          <w:sz w:val="32"/>
-          <w:szCs w:val="32"/>
-        </w:rPr>
-        <w:t>权承诺书</w:t>
-      </w:r>
-      <w:r>
-        <w:rPr>
-          <w:rFonts w:ascii="___WRD_EMBED_SUB_44" w:eastAsia="___WRD_EMBED_SUB_44" w:hAnsi="___WRD_EMBED_SUB_44" w:cs="___WRD_EMBED_SUB_44" w:hint="eastAsia"/>
-          <w:sz w:val="32"/>
-          <w:szCs w:val="32"/>
-        </w:rPr>
-        <w:t>及项目开发与</w:t>
-      </w:r>
-      <w:r>
-        <w:rPr>
-          <w:rFonts w:ascii="宋体" w:eastAsia="宋体" w:hAnsi="宋体" w:cs="宋体" w:hint="eastAsia"/>
-          <w:sz w:val="32"/>
-          <w:szCs w:val="32"/>
-        </w:rPr>
-        <w:t>过</w:t>
-      </w:r>
-      <w:r>
-        <w:rPr>
-          <w:rFonts w:ascii="___WRD_EMBED_SUB_44" w:eastAsia="___WRD_EMBED_SUB_44" w:hAnsi="___WRD_EMBED_SUB_44" w:cs="___WRD_EMBED_SUB_44" w:hint="eastAsia"/>
-          <w:sz w:val="32"/>
-          <w:szCs w:val="32"/>
-        </w:rPr>
-        <w:t>程证</w:t>
-      </w:r>
-      <w:r>
-        <w:rPr>
-          <w:rFonts w:ascii="宋体" w:eastAsia="宋体" w:hAnsi="宋体" w:cs="宋体" w:hint="eastAsia"/>
-          <w:sz w:val="32"/>
-          <w:szCs w:val="32"/>
-        </w:rPr>
-        <w:t>明</w:t>
-      </w:r>
-      <w:r>
-        <w:rPr>
-          <w:rFonts w:ascii="___WRD_EMBED_SUB_44" w:eastAsia="___WRD_EMBED_SUB_44" w:hAnsi="___WRD_EMBED_SUB_44" w:cs="___WRD_EMBED_SUB_44" w:hint="eastAsia"/>
-          <w:sz w:val="32"/>
-          <w:szCs w:val="32"/>
-        </w:rPr>
-        <w:t>材料。</w:t>
+          <w:rFonts w:ascii="方正仿宋_GB2312" w:eastAsia="方正仿宋_GB2312" w:hAnsi="方正仿宋_GB2312" w:cs="方正仿宋_GB2312" w:hint="eastAsia"/>
+          <w:sz w:val="32"/>
+          <w:szCs w:val="32"/>
+        </w:rPr>
+        <w:t>8</w:t>
+      </w:r>
+      <w:r>
+        <w:rPr>
+          <w:rFonts w:ascii="方正仿宋_GB2312" w:eastAsia="方正仿宋_GB2312" w:hAnsi="方正仿宋_GB2312" w:cs="方正仿宋_GB2312" w:hint="eastAsia"/>
+          <w:sz w:val="32"/>
+          <w:szCs w:val="32"/>
+        </w:rPr>
+        <w:t>分钟路演展示</w:t>
+      </w:r>
+      <w:r>
+        <w:rPr>
+          <w:rFonts w:ascii="方正仿宋_GB2312" w:eastAsia="方正仿宋_GB2312" w:hAnsi="方正仿宋_GB2312" w:cs="方正仿宋_GB2312" w:hint="eastAsia"/>
+          <w:sz w:val="32"/>
+          <w:szCs w:val="32"/>
+        </w:rPr>
+        <w:t>+4</w:t>
+      </w:r>
+      <w:r>
+        <w:rPr>
+          <w:rFonts w:ascii="方正仿宋_GB2312" w:eastAsia="方正仿宋_GB2312" w:hAnsi="方正仿宋_GB2312" w:cs="方正仿宋_GB2312" w:hint="eastAsia"/>
+          <w:sz w:val="32"/>
+          <w:szCs w:val="32"/>
+        </w:rPr>
+        <w:t>至</w:t>
+      </w:r>
+      <w:r>
+        <w:rPr>
+          <w:rFonts w:ascii="方正仿宋_GB2312" w:eastAsia="方正仿宋_GB2312" w:hAnsi="方正仿宋_GB2312" w:cs="方正仿宋_GB2312" w:hint="eastAsia"/>
+          <w:sz w:val="32"/>
+          <w:szCs w:val="32"/>
+        </w:rPr>
+        <w:t>5</w:t>
+      </w:r>
+      <w:r>
+        <w:rPr>
+          <w:rFonts w:ascii="方正仿宋_GB2312" w:eastAsia="方正仿宋_GB2312" w:hAnsi="方正仿宋_GB2312" w:cs="方正仿宋_GB2312" w:hint="eastAsia"/>
+          <w:sz w:val="32"/>
+          <w:szCs w:val="32"/>
+        </w:rPr>
+        <w:t>分钟专家问答”的方式进行。参赛团队应围绕问题来源、技术方案、阶段成果、演示内容、团队贡献和后续计划进行集中展示。具体时间、地点及入围安排以组委会后续通知为准。</w:t>
+      </w:r>
+    </w:p>
+    <w:p>
+      <w:pPr>
+        <w:ind w:firstLineChars="200" w:firstLine="640"/>
+        <w:rPr>
+          <w:rFonts w:ascii="黑体" w:eastAsia="黑体" w:hAnsi="黑体" w:cs="黑体"/>
+          <w:sz w:val="32"/>
+          <w:szCs w:val="32"/>
+        </w:rPr>
+      </w:pPr>
+      <w:r>
+        <w:rPr>
+          <w:rFonts w:ascii="黑体" w:eastAsia="黑体" w:hAnsi="黑体" w:cs="黑体" w:hint="eastAsia"/>
+          <w:sz w:val="32"/>
+          <w:szCs w:val="32"/>
+        </w:rPr>
+        <w:t xml:space="preserve">九、评审方式</w:t>
       </w:r>
     </w:p>
     <w:p>
@@ -1529,347 +2330,29 @@
       </w:pPr>
       <w:r>
         <w:rPr>
-          <w:rFonts w:ascii="宋体" w:eastAsia="宋体" w:hAnsi="宋体" w:cs="宋体" w:hint="eastAsia"/>
-          <w:sz w:val="32"/>
-          <w:szCs w:val="32"/>
-        </w:rPr>
-        <w:t>（</w:t>
-      </w:r>
-      <w:r>
-        <w:rPr>
-          <w:rFonts w:ascii="方正仿宋_GB2312" w:eastAsia="方正仿宋_GB2312" w:hAnsi="方正仿宋_GB2312" w:cs="方正仿宋_GB2312"/>
-          <w:sz w:val="32"/>
-          <w:szCs w:val="32"/>
-        </w:rPr>
-        <w:t>3</w:t>
-      </w:r>
-      <w:r>
-        <w:rPr>
-          <w:rFonts w:ascii="宋体" w:eastAsia="宋体" w:hAnsi="宋体" w:cs="宋体" w:hint="eastAsia"/>
-          <w:sz w:val="32"/>
-          <w:szCs w:val="32"/>
-        </w:rPr>
-        <w:t>）初</w:t>
-      </w:r>
-      <w:r>
-        <w:rPr>
-          <w:rFonts w:ascii="___WRD_EMBED_SUB_44" w:eastAsia="___WRD_EMBED_SUB_44" w:hAnsi="___WRD_EMBED_SUB_44" w:cs="___WRD_EMBED_SUB_44" w:hint="eastAsia"/>
-          <w:sz w:val="32"/>
-          <w:szCs w:val="32"/>
-        </w:rPr>
-        <w:t>赛材料提交与资格审</w:t>
-      </w:r>
-      <w:r>
-        <w:rPr>
-          <w:rFonts w:ascii="宋体" w:eastAsia="宋体" w:hAnsi="宋体" w:cs="宋体" w:hint="eastAsia"/>
-          <w:sz w:val="32"/>
-          <w:szCs w:val="32"/>
-        </w:rPr>
-        <w:t>核</w:t>
-      </w:r>
-      <w:r>
-        <w:rPr>
-          <w:rFonts w:ascii="___WRD_EMBED_SUB_44" w:eastAsia="___WRD_EMBED_SUB_44" w:hAnsi="___WRD_EMBED_SUB_44" w:cs="___WRD_EMBED_SUB_44" w:hint="eastAsia"/>
-          <w:sz w:val="32"/>
-          <w:szCs w:val="32"/>
-        </w:rPr>
-        <w:t>：</w:t>
-      </w:r>
-      <w:r>
-        <w:rPr>
-          <w:rFonts w:ascii="方正仿宋_GB2312" w:eastAsia="方正仿宋_GB2312" w:hAnsi="方正仿宋_GB2312" w:cs="方正仿宋_GB2312"/>
-          <w:sz w:val="32"/>
-          <w:szCs w:val="32"/>
-        </w:rPr>
-        <w:t>2026年10月1日</w:t>
-      </w:r>
-      <w:r>
-        <w:rPr>
-          <w:rFonts w:ascii="宋体" w:eastAsia="宋体" w:hAnsi="宋体" w:cs="宋体" w:hint="eastAsia"/>
-          <w:sz w:val="32"/>
-          <w:szCs w:val="32"/>
-        </w:rPr>
-        <w:t>至</w:t>
-      </w:r>
-      <w:r>
-        <w:rPr>
-          <w:rFonts w:ascii="方正仿宋_GB2312" w:eastAsia="方正仿宋_GB2312" w:hAnsi="方正仿宋_GB2312" w:cs="方正仿宋_GB2312"/>
-          <w:sz w:val="32"/>
-          <w:szCs w:val="32"/>
-        </w:rPr>
-        <w:t>10月8日，</w:t>
-      </w:r>
-      <w:r>
-        <w:rPr>
-          <w:rFonts w:ascii="宋体" w:eastAsia="宋体" w:hAnsi="宋体" w:cs="宋体" w:hint="eastAsia"/>
-          <w:sz w:val="32"/>
-          <w:szCs w:val="32"/>
-        </w:rPr>
-        <w:t>已完成</w:t>
-      </w:r>
-      <w:r>
-        <w:rPr>
-          <w:rFonts w:ascii="___WRD_EMBED_SUB_44" w:eastAsia="___WRD_EMBED_SUB_44" w:hAnsi="___WRD_EMBED_SUB_44" w:cs="___WRD_EMBED_SUB_44" w:hint="eastAsia"/>
-          <w:sz w:val="32"/>
-          <w:szCs w:val="32"/>
-        </w:rPr>
-        <w:t>报名确</w:t>
-      </w:r>
-      <w:r>
-        <w:rPr>
-          <w:rFonts w:ascii="宋体" w:eastAsia="宋体" w:hAnsi="宋体" w:cs="宋体" w:hint="eastAsia"/>
-          <w:sz w:val="32"/>
-          <w:szCs w:val="32"/>
-        </w:rPr>
-        <w:t>认</w:t>
-      </w:r>
-      <w:r>
-        <w:rPr>
-          <w:rFonts w:ascii="___WRD_EMBED_SUB_44" w:eastAsia="___WRD_EMBED_SUB_44" w:hAnsi="___WRD_EMBED_SUB_44" w:cs="___WRD_EMBED_SUB_44" w:hint="eastAsia"/>
-          <w:sz w:val="32"/>
-          <w:szCs w:val="32"/>
-        </w:rPr>
-        <w:t>的项目</w:t>
-      </w:r>
-      <w:r>
-        <w:rPr>
-          <w:rFonts w:ascii="宋体" w:eastAsia="宋体" w:hAnsi="宋体" w:cs="宋体" w:hint="eastAsia"/>
-          <w:sz w:val="32"/>
-          <w:szCs w:val="32"/>
-        </w:rPr>
-        <w:t>可继</w:t>
-      </w:r>
-      <w:r>
-        <w:rPr>
-          <w:rFonts w:ascii="___WRD_EMBED_SUB_44" w:eastAsia="___WRD_EMBED_SUB_44" w:hAnsi="___WRD_EMBED_SUB_44" w:cs="___WRD_EMBED_SUB_44" w:hint="eastAsia"/>
-          <w:sz w:val="32"/>
-          <w:szCs w:val="32"/>
-        </w:rPr>
-        <w:t>续</w:t>
-      </w:r>
-      <w:r>
-        <w:rPr>
-          <w:rFonts w:ascii="宋体" w:eastAsia="宋体" w:hAnsi="宋体" w:cs="宋体" w:hint="eastAsia"/>
-          <w:sz w:val="32"/>
-          <w:szCs w:val="32"/>
-        </w:rPr>
-        <w:t>完善并</w:t>
-      </w:r>
-      <w:r>
-        <w:rPr>
-          <w:rFonts w:ascii="___WRD_EMBED_SUB_44" w:eastAsia="___WRD_EMBED_SUB_44" w:hAnsi="___WRD_EMBED_SUB_44" w:cs="___WRD_EMBED_SUB_44" w:hint="eastAsia"/>
-          <w:sz w:val="32"/>
-          <w:szCs w:val="32"/>
-        </w:rPr>
-        <w:t>提交</w:t>
-      </w:r>
-      <w:r>
-        <w:rPr>
-          <w:rFonts w:ascii="宋体" w:eastAsia="宋体" w:hAnsi="宋体" w:cs="宋体" w:hint="eastAsia"/>
-          <w:sz w:val="32"/>
-          <w:szCs w:val="32"/>
-        </w:rPr>
-        <w:t>初</w:t>
-      </w:r>
-      <w:r>
-        <w:rPr>
-          <w:rFonts w:ascii="___WRD_EMBED_SUB_44" w:eastAsia="___WRD_EMBED_SUB_44" w:hAnsi="___WRD_EMBED_SUB_44" w:cs="___WRD_EMBED_SUB_44" w:hint="eastAsia"/>
-          <w:sz w:val="32"/>
-          <w:szCs w:val="32"/>
-        </w:rPr>
-        <w:t>赛材料，全部</w:t>
-      </w:r>
-      <w:r>
-        <w:rPr>
-          <w:rFonts w:ascii="宋体" w:eastAsia="宋体" w:hAnsi="宋体" w:cs="宋体" w:hint="eastAsia"/>
-          <w:sz w:val="32"/>
-          <w:szCs w:val="32"/>
-        </w:rPr>
-        <w:t>必</w:t>
-      </w:r>
-      <w:r>
-        <w:rPr>
-          <w:rFonts w:ascii="___WRD_EMBED_SUB_44" w:eastAsia="___WRD_EMBED_SUB_44" w:hAnsi="___WRD_EMBED_SUB_44" w:cs="___WRD_EMBED_SUB_44" w:hint="eastAsia"/>
-          <w:sz w:val="32"/>
-          <w:szCs w:val="32"/>
-        </w:rPr>
-        <w:t>交材料</w:t>
-      </w:r>
-      <w:r>
-        <w:rPr>
-          <w:rFonts w:ascii="宋体" w:eastAsia="宋体" w:hAnsi="宋体" w:cs="宋体" w:hint="eastAsia"/>
-          <w:sz w:val="32"/>
-          <w:szCs w:val="32"/>
-        </w:rPr>
-        <w:t>于</w:t>
-      </w:r>
-      <w:r>
-        <w:rPr>
-          <w:rFonts w:ascii="方正仿宋_GB2312" w:eastAsia="方正仿宋_GB2312" w:hAnsi="方正仿宋_GB2312" w:cs="方正仿宋_GB2312"/>
-          <w:sz w:val="32"/>
-          <w:szCs w:val="32"/>
-        </w:rPr>
-        <w:t>10月8日</w:t>
-      </w:r>
-      <w:r>
-        <w:rPr>
-          <w:rFonts w:ascii="宋体" w:eastAsia="宋体" w:hAnsi="宋体" w:cs="宋体" w:hint="eastAsia"/>
-          <w:sz w:val="32"/>
-          <w:szCs w:val="32"/>
-        </w:rPr>
-        <w:t>截止</w:t>
-      </w:r>
-      <w:r>
-        <w:rPr>
-          <w:rFonts w:ascii="___WRD_EMBED_SUB_44" w:eastAsia="___WRD_EMBED_SUB_44" w:hAnsi="___WRD_EMBED_SUB_44" w:cs="___WRD_EMBED_SUB_44" w:hint="eastAsia"/>
-          <w:sz w:val="32"/>
-          <w:szCs w:val="32"/>
-        </w:rPr>
-        <w:t>提交，具体时</w:t>
-      </w:r>
-      <w:r>
-        <w:rPr>
-          <w:rFonts w:ascii="宋体" w:eastAsia="宋体" w:hAnsi="宋体" w:cs="宋体" w:hint="eastAsia"/>
-          <w:sz w:val="32"/>
-          <w:szCs w:val="32"/>
-        </w:rPr>
-        <w:t>点以</w:t>
-      </w:r>
-      <w:r>
-        <w:rPr>
-          <w:rFonts w:ascii="___WRD_EMBED_SUB_44" w:eastAsia="___WRD_EMBED_SUB_44" w:hAnsi="___WRD_EMBED_SUB_44" w:cs="___WRD_EMBED_SUB_44" w:hint="eastAsia"/>
-          <w:sz w:val="32"/>
-          <w:szCs w:val="32"/>
-        </w:rPr>
-        <w:t>报名系统</w:t>
-      </w:r>
-      <w:r>
-        <w:rPr>
-          <w:rFonts w:ascii="宋体" w:eastAsia="宋体" w:hAnsi="宋体" w:cs="宋体" w:hint="eastAsia"/>
-          <w:sz w:val="32"/>
-          <w:szCs w:val="32"/>
-        </w:rPr>
-        <w:t>或</w:t>
-      </w:r>
-      <w:r>
-        <w:rPr>
-          <w:rFonts w:ascii="___WRD_EMBED_SUB_44" w:eastAsia="___WRD_EMBED_SUB_44" w:hAnsi="___WRD_EMBED_SUB_44" w:cs="___WRD_EMBED_SUB_44" w:hint="eastAsia"/>
-          <w:sz w:val="32"/>
-          <w:szCs w:val="32"/>
-        </w:rPr>
-        <w:t>组委会</w:t>
-      </w:r>
-      <w:r>
-        <w:rPr>
-          <w:rFonts w:ascii="宋体" w:eastAsia="宋体" w:hAnsi="宋体" w:cs="宋体" w:hint="eastAsia"/>
-          <w:sz w:val="32"/>
-          <w:szCs w:val="32"/>
-        </w:rPr>
-        <w:t>通</w:t>
-      </w:r>
-      <w:r>
-        <w:rPr>
-          <w:rFonts w:ascii="___WRD_EMBED_SUB_44" w:eastAsia="___WRD_EMBED_SUB_44" w:hAnsi="___WRD_EMBED_SUB_44" w:cs="___WRD_EMBED_SUB_44" w:hint="eastAsia"/>
-          <w:sz w:val="32"/>
-          <w:szCs w:val="32"/>
-        </w:rPr>
-        <w:t>知为准。工</w:t>
-      </w:r>
-      <w:r>
-        <w:rPr>
-          <w:rFonts w:ascii="宋体" w:eastAsia="宋体" w:hAnsi="宋体" w:cs="宋体" w:hint="eastAsia"/>
-          <w:sz w:val="32"/>
-          <w:szCs w:val="32"/>
-        </w:rPr>
-        <w:t>作</w:t>
-      </w:r>
-      <w:r>
-        <w:rPr>
-          <w:rFonts w:ascii="___WRD_EMBED_SUB_44" w:eastAsia="___WRD_EMBED_SUB_44" w:hAnsi="___WRD_EMBED_SUB_44" w:cs="___WRD_EMBED_SUB_44" w:hint="eastAsia"/>
-          <w:sz w:val="32"/>
-          <w:szCs w:val="32"/>
-        </w:rPr>
-        <w:t>人</w:t>
-      </w:r>
-      <w:r>
-        <w:rPr>
-          <w:rFonts w:ascii="宋体" w:eastAsia="宋体" w:hAnsi="宋体" w:cs="宋体" w:hint="eastAsia"/>
-          <w:sz w:val="32"/>
-          <w:szCs w:val="32"/>
-        </w:rPr>
-        <w:t>员</w:t>
-      </w:r>
-      <w:r>
-        <w:rPr>
-          <w:rFonts w:ascii="___WRD_EMBED_SUB_44" w:eastAsia="___WRD_EMBED_SUB_44" w:hAnsi="___WRD_EMBED_SUB_44" w:cs="___WRD_EMBED_SUB_44" w:hint="eastAsia"/>
-          <w:sz w:val="32"/>
-          <w:szCs w:val="32"/>
-        </w:rPr>
-        <w:t>同步开展材料</w:t>
-      </w:r>
-      <w:r>
-        <w:rPr>
-          <w:rFonts w:ascii="宋体" w:eastAsia="宋体" w:hAnsi="宋体" w:cs="宋体" w:hint="eastAsia"/>
-          <w:sz w:val="32"/>
-          <w:szCs w:val="32"/>
-        </w:rPr>
-        <w:t>完整</w:t>
-      </w:r>
-      <w:r>
-        <w:rPr>
-          <w:rFonts w:ascii="___WRD_EMBED_SUB_44" w:eastAsia="___WRD_EMBED_SUB_44" w:hAnsi="___WRD_EMBED_SUB_44" w:cs="___WRD_EMBED_SUB_44" w:hint="eastAsia"/>
-          <w:sz w:val="32"/>
-          <w:szCs w:val="32"/>
-        </w:rPr>
-        <w:t>性、资格</w:t>
-      </w:r>
-      <w:r>
-        <w:rPr>
-          <w:rFonts w:ascii="宋体" w:eastAsia="宋体" w:hAnsi="宋体" w:cs="宋体" w:hint="eastAsia"/>
-          <w:sz w:val="32"/>
-          <w:szCs w:val="32"/>
-        </w:rPr>
-        <w:t>符</w:t>
-      </w:r>
-      <w:r>
-        <w:rPr>
-          <w:rFonts w:ascii="___WRD_EMBED_SUB_44" w:eastAsia="___WRD_EMBED_SUB_44" w:hAnsi="___WRD_EMBED_SUB_44" w:cs="___WRD_EMBED_SUB_44" w:hint="eastAsia"/>
-          <w:sz w:val="32"/>
-          <w:szCs w:val="32"/>
-        </w:rPr>
-        <w:t>合性、赛道适</w:t>
-      </w:r>
-      <w:r>
-        <w:rPr>
-          <w:rFonts w:ascii="宋体" w:eastAsia="宋体" w:hAnsi="宋体" w:cs="宋体" w:hint="eastAsia"/>
-          <w:sz w:val="32"/>
-          <w:szCs w:val="32"/>
-        </w:rPr>
-        <w:t>配</w:t>
-      </w:r>
-      <w:r>
-        <w:rPr>
-          <w:rFonts w:ascii="___WRD_EMBED_SUB_44" w:eastAsia="___WRD_EMBED_SUB_44" w:hAnsi="___WRD_EMBED_SUB_44" w:cs="___WRD_EMBED_SUB_44" w:hint="eastAsia"/>
-          <w:sz w:val="32"/>
-          <w:szCs w:val="32"/>
-        </w:rPr>
-        <w:t>性和基础合规审</w:t>
-      </w:r>
-      <w:r>
-        <w:rPr>
-          <w:rFonts w:ascii="宋体" w:eastAsia="宋体" w:hAnsi="宋体" w:cs="宋体" w:hint="eastAsia"/>
-          <w:sz w:val="32"/>
-          <w:szCs w:val="32"/>
-        </w:rPr>
-        <w:t>查</w:t>
-      </w:r>
-      <w:r>
-        <w:rPr>
-          <w:rFonts w:ascii="___WRD_EMBED_SUB_44" w:eastAsia="___WRD_EMBED_SUB_44" w:hAnsi="___WRD_EMBED_SUB_44" w:cs="___WRD_EMBED_SUB_44" w:hint="eastAsia"/>
-          <w:sz w:val="32"/>
-          <w:szCs w:val="32"/>
-        </w:rPr>
-        <w:t>。</w:t>
+          <w:rFonts w:ascii="方正仿宋_GB2312" w:eastAsia="方正仿宋_GB2312" w:hAnsi="方正仿宋_GB2312" w:cs="方正仿宋_GB2312" w:hint="eastAsia"/>
+          <w:sz w:val="32"/>
+          <w:szCs w:val="32"/>
+        </w:rPr>
+        <w:t>大赛评审工作坚持分组评价、分道评价、分阶段评价、公开规范评价原则。初赛阶段采取材料评审方式，重点审查项目材料完整性、逻辑清晰度、开发过程证据、成果基础、发展潜力及赛道适配性；决赛阶段采取路演展示与专家答辩相结合的方式进行，重点考察项目展示效果、现场表达能力、专家问答质量、成果真实性、开发完成度、演示完成度和后续迭代能力。</w:t>
+      </w:r>
+    </w:p>
+    <w:p>
+      <w:pPr>
+        <w:ind w:firstLineChars="200" w:firstLine="640"/>
+        <w:rPr>
+          <w:rFonts w:ascii="黑体" w:eastAsia="黑体" w:hAnsi="黑体" w:cs="黑体"/>
+          <w:sz w:val="32"/>
+          <w:szCs w:val="32"/>
+        </w:rPr>
+      </w:pPr>
+      <w:r>
+        <w:rPr>
+          <w:rFonts w:ascii="黑体" w:eastAsia="黑体" w:hAnsi="黑体" w:cs="黑体" w:hint="eastAsia"/>
+          <w:sz w:val="32"/>
+          <w:szCs w:val="32"/>
+        </w:rPr>
+        <w:t xml:space="preserve">十、纪律与要求</w:t>
       </w:r>
     </w:p>
     <w:p>
@@ -1888,103 +2371,7 @@
           <w:sz w:val="32"/>
           <w:szCs w:val="32"/>
         </w:rPr>
-        <w:t>（</w:t>
-      </w:r>
-      <w:r>
-        <w:rPr>
-          <w:rFonts w:ascii="方正仿宋_GB2312" w:eastAsia="方正仿宋_GB2312" w:hAnsi="方正仿宋_GB2312" w:cs="方正仿宋_GB2312" w:hint="eastAsia"/>
-          <w:sz w:val="32"/>
-          <w:szCs w:val="32"/>
-        </w:rPr>
-        <w:t>4</w:t>
-      </w:r>
-      <w:r>
-        <w:rPr>
-          <w:rFonts w:ascii="方正仿宋_GB2312" w:eastAsia="方正仿宋_GB2312" w:hAnsi="方正仿宋_GB2312" w:cs="方正仿宋_GB2312" w:hint="eastAsia"/>
-          <w:sz w:val="32"/>
-          <w:szCs w:val="32"/>
-        </w:rPr>
-        <w:t>）初赛评审与入围确认：</w:t>
-      </w:r>
-      <w:r>
-        <w:rPr>
-          <w:rFonts w:ascii="方正仿宋_GB2312" w:eastAsia="方正仿宋_GB2312" w:hAnsi="方正仿宋_GB2312" w:cs="方正仿宋_GB2312" w:hint="eastAsia"/>
-          <w:sz w:val="32"/>
-          <w:szCs w:val="32"/>
-        </w:rPr>
-        <w:t>2026</w:t>
-      </w:r>
-      <w:r>
-        <w:rPr>
-          <w:rFonts w:ascii="方正仿宋_GB2312" w:eastAsia="方正仿宋_GB2312" w:hAnsi="方正仿宋_GB2312" w:cs="方正仿宋_GB2312" w:hint="eastAsia"/>
-          <w:sz w:val="32"/>
-          <w:szCs w:val="32"/>
-        </w:rPr>
-        <w:t>年</w:t>
-      </w:r>
-      <w:r>
-        <w:rPr>
-          <w:rFonts w:ascii="方正仿宋_GB2312" w:eastAsia="方正仿宋_GB2312" w:hAnsi="方正仿宋_GB2312" w:cs="方正仿宋_GB2312" w:hint="eastAsia"/>
-          <w:sz w:val="32"/>
-          <w:szCs w:val="32"/>
-        </w:rPr>
-        <w:t>10</w:t>
-      </w:r>
-      <w:r>
-        <w:rPr>
-          <w:rFonts w:ascii="方正仿宋_GB2312" w:eastAsia="方正仿宋_GB2312" w:hAnsi="方正仿宋_GB2312" w:cs="方正仿宋_GB2312" w:hint="eastAsia"/>
-          <w:sz w:val="32"/>
-          <w:szCs w:val="32"/>
-        </w:rPr>
-        <w:t>月</w:t>
-      </w:r>
-      <w:r>
-        <w:rPr>
-          <w:rFonts w:ascii="方正仿宋_GB2312" w:eastAsia="方正仿宋_GB2312" w:hAnsi="方正仿宋_GB2312" w:cs="方正仿宋_GB2312" w:hint="eastAsia"/>
-          <w:sz w:val="32"/>
-          <w:szCs w:val="32"/>
-        </w:rPr>
-        <w:t>9</w:t>
-      </w:r>
-      <w:r>
-        <w:rPr>
-          <w:rFonts w:ascii="方正仿宋_GB2312" w:eastAsia="方正仿宋_GB2312" w:hAnsi="方正仿宋_GB2312" w:cs="方正仿宋_GB2312" w:hint="eastAsia"/>
-          <w:sz w:val="32"/>
-          <w:szCs w:val="32"/>
-        </w:rPr>
-        <w:t>日至</w:t>
-      </w:r>
-      <w:r>
-        <w:rPr>
-          <w:rFonts w:ascii="方正仿宋_GB2312" w:eastAsia="方正仿宋_GB2312" w:hAnsi="方正仿宋_GB2312" w:cs="方正仿宋_GB2312" w:hint="eastAsia"/>
-          <w:sz w:val="32"/>
-          <w:szCs w:val="32"/>
-        </w:rPr>
-        <w:t>10</w:t>
-      </w:r>
-      <w:r>
-        <w:rPr>
-          <w:rFonts w:ascii="方正仿宋_GB2312" w:eastAsia="方正仿宋_GB2312" w:hAnsi="方正仿宋_GB2312" w:cs="方正仿宋_GB2312" w:hint="eastAsia"/>
-          <w:sz w:val="32"/>
-          <w:szCs w:val="32"/>
-        </w:rPr>
-        <w:t>月</w:t>
-      </w:r>
-      <w:r>
-        <w:rPr>
-          <w:rFonts w:ascii="方正仿宋_GB2312" w:eastAsia="方正仿宋_GB2312" w:hAnsi="方正仿宋_GB2312" w:cs="方正仿宋_GB2312" w:hint="eastAsia"/>
-          <w:sz w:val="32"/>
-          <w:szCs w:val="32"/>
-        </w:rPr>
-        <w:t>13</w:t>
-      </w:r>
-      <w:r>
-        <w:rPr>
-          <w:rFonts w:ascii="方正仿宋_GB2312" w:eastAsia="方正仿宋_GB2312" w:hAnsi="方正仿宋_GB2312" w:cs="方正仿宋_GB2312" w:hint="eastAsia"/>
-          <w:sz w:val="32"/>
-          <w:szCs w:val="32"/>
-        </w:rPr>
-        <w:t>日组织线上材料评审，对初赛晋级项目进行线上陈述或问答，综合确定拟入围决赛项目。</w:t>
+        <w:t>各参赛团队须严格遵守赛事规则，如实填报报名信息、身份信息、项目材料及相关说明，并按要求全程参与评审、展示和答辩等环节。团队成员须对项目作出实际贡献，不得挂名参赛，不得借用他人成果参赛，不得冒用他人身份参赛，不得虚构团队成员、项目基础、用户数据、合作资源或运营成果。</w:t>
       </w:r>
     </w:p>
     <w:p>
@@ -2003,103 +2390,25 @@
           <w:sz w:val="32"/>
           <w:szCs w:val="32"/>
         </w:rPr>
-        <w:t>（</w:t>
-      </w:r>
-      <w:r>
-        <w:rPr>
-          <w:rFonts w:ascii="方正仿宋_GB2312" w:eastAsia="方正仿宋_GB2312" w:hAnsi="方正仿宋_GB2312" w:cs="方正仿宋_GB2312" w:hint="eastAsia"/>
-          <w:sz w:val="32"/>
-          <w:szCs w:val="32"/>
-        </w:rPr>
-        <w:t>5</w:t>
-      </w:r>
-      <w:r>
-        <w:rPr>
-          <w:rFonts w:ascii="方正仿宋_GB2312" w:eastAsia="方正仿宋_GB2312" w:hAnsi="方正仿宋_GB2312" w:cs="方正仿宋_GB2312" w:hint="eastAsia"/>
-          <w:sz w:val="32"/>
-          <w:szCs w:val="32"/>
-        </w:rPr>
-        <w:t>）项目打磨与决赛材料复核：</w:t>
-      </w:r>
-      <w:r>
-        <w:rPr>
-          <w:rFonts w:ascii="方正仿宋_GB2312" w:eastAsia="方正仿宋_GB2312" w:hAnsi="方正仿宋_GB2312" w:cs="方正仿宋_GB2312" w:hint="eastAsia"/>
-          <w:sz w:val="32"/>
-          <w:szCs w:val="32"/>
-        </w:rPr>
-        <w:t>2026</w:t>
-      </w:r>
-      <w:r>
-        <w:rPr>
-          <w:rFonts w:ascii="方正仿宋_GB2312" w:eastAsia="方正仿宋_GB2312" w:hAnsi="方正仿宋_GB2312" w:cs="方正仿宋_GB2312" w:hint="eastAsia"/>
-          <w:sz w:val="32"/>
-          <w:szCs w:val="32"/>
-        </w:rPr>
-        <w:t>年</w:t>
-      </w:r>
-      <w:r>
-        <w:rPr>
-          <w:rFonts w:ascii="方正仿宋_GB2312" w:eastAsia="方正仿宋_GB2312" w:hAnsi="方正仿宋_GB2312" w:cs="方正仿宋_GB2312" w:hint="eastAsia"/>
-          <w:sz w:val="32"/>
-          <w:szCs w:val="32"/>
-        </w:rPr>
-        <w:t>10</w:t>
-      </w:r>
-      <w:r>
-        <w:rPr>
-          <w:rFonts w:ascii="方正仿宋_GB2312" w:eastAsia="方正仿宋_GB2312" w:hAnsi="方正仿宋_GB2312" w:cs="方正仿宋_GB2312" w:hint="eastAsia"/>
-          <w:sz w:val="32"/>
-          <w:szCs w:val="32"/>
-        </w:rPr>
-        <w:t>月</w:t>
-      </w:r>
-      <w:r>
-        <w:rPr>
-          <w:rFonts w:ascii="方正仿宋_GB2312" w:eastAsia="方正仿宋_GB2312" w:hAnsi="方正仿宋_GB2312" w:cs="方正仿宋_GB2312" w:hint="eastAsia"/>
-          <w:sz w:val="32"/>
-          <w:szCs w:val="32"/>
-        </w:rPr>
-        <w:t>13</w:t>
-      </w:r>
-      <w:r>
-        <w:rPr>
-          <w:rFonts w:ascii="方正仿宋_GB2312" w:eastAsia="方正仿宋_GB2312" w:hAnsi="方正仿宋_GB2312" w:cs="方正仿宋_GB2312" w:hint="eastAsia"/>
-          <w:sz w:val="32"/>
-          <w:szCs w:val="32"/>
-        </w:rPr>
-        <w:t>日至</w:t>
-      </w:r>
-      <w:r>
-        <w:rPr>
-          <w:rFonts w:ascii="方正仿宋_GB2312" w:eastAsia="方正仿宋_GB2312" w:hAnsi="方正仿宋_GB2312" w:cs="方正仿宋_GB2312" w:hint="eastAsia"/>
-          <w:sz w:val="32"/>
-          <w:szCs w:val="32"/>
-        </w:rPr>
-        <w:t>10</w:t>
-      </w:r>
-      <w:r>
-        <w:rPr>
-          <w:rFonts w:ascii="方正仿宋_GB2312" w:eastAsia="方正仿宋_GB2312" w:hAnsi="方正仿宋_GB2312" w:cs="方正仿宋_GB2312" w:hint="eastAsia"/>
-          <w:sz w:val="32"/>
-          <w:szCs w:val="32"/>
-        </w:rPr>
-        <w:t>月</w:t>
-      </w:r>
-      <w:r>
-        <w:rPr>
-          <w:rFonts w:ascii="方正仿宋_GB2312" w:eastAsia="方正仿宋_GB2312" w:hAnsi="方正仿宋_GB2312" w:cs="方正仿宋_GB2312" w:hint="eastAsia"/>
-          <w:sz w:val="32"/>
-          <w:szCs w:val="32"/>
-        </w:rPr>
-        <w:t>18</w:t>
-      </w:r>
-      <w:r>
-        <w:rPr>
-          <w:rFonts w:ascii="方正仿宋_GB2312" w:eastAsia="方正仿宋_GB2312" w:hAnsi="方正仿宋_GB2312" w:cs="方正仿宋_GB2312" w:hint="eastAsia"/>
-          <w:sz w:val="32"/>
-          <w:szCs w:val="32"/>
-        </w:rPr>
-        <w:t>日组织入围项目开展展示内容打磨、路演材料完善和演示准备，并对真实性、知识产权、团队成员身份、项目成果及相关证明材料进行复核。</w:t>
+        <w:t xml:space="preserve">参赛项目必须坚持正确导向，确保内容真实、健康、合法。项目所涉及的发明创造、专利技术、数据资源、代码成果、设计作品、模型样机、合作资源等，须具有清晰、合法、可明确说明的知识产权归属或使用授权。凡经查实存在弄虚作假、侵权违规、冒名参赛、虚假包装等行为的，组委会将取消其参赛资格；情节严重的，纳入赛事诚信管理范围，并保留依法依规进一步处理的权利。</w:t>
+      </w:r>
+    </w:p>
+    <w:p>
+      <w:pPr>
+        <w:ind w:firstLineChars="200" w:firstLine="640"/>
+        <w:rPr>
+          <w:rFonts w:ascii="黑体" w:eastAsia="黑体" w:hAnsi="黑体" w:cs="黑体"/>
+          <w:sz w:val="32"/>
+          <w:szCs w:val="32"/>
+        </w:rPr>
+      </w:pPr>
+      <w:r>
+        <w:rPr>
+          <w:rFonts w:ascii="黑体" w:eastAsia="黑体" w:hAnsi="黑体" w:cs="黑体" w:hint="eastAsia"/>
+          <w:sz w:val="32"/>
+          <w:szCs w:val="32"/>
+        </w:rPr>
+        <w:t xml:space="preserve">十一、其他事项</w:t>
       </w:r>
     </w:p>
     <w:p>
@@ -2118,103 +2427,7 @@
           <w:sz w:val="32"/>
           <w:szCs w:val="32"/>
         </w:rPr>
-        <w:t>（</w:t>
-      </w:r>
-      <w:r>
-        <w:rPr>
-          <w:rFonts w:ascii="方正仿宋_GB2312" w:eastAsia="方正仿宋_GB2312" w:hAnsi="方正仿宋_GB2312" w:cs="方正仿宋_GB2312" w:hint="eastAsia"/>
-          <w:sz w:val="32"/>
-          <w:szCs w:val="32"/>
-        </w:rPr>
-        <w:t>6</w:t>
-      </w:r>
-      <w:r>
-        <w:rPr>
-          <w:rFonts w:ascii="方正仿宋_GB2312" w:eastAsia="方正仿宋_GB2312" w:hAnsi="方正仿宋_GB2312" w:cs="方正仿宋_GB2312" w:hint="eastAsia"/>
-          <w:sz w:val="32"/>
-          <w:szCs w:val="32"/>
-        </w:rPr>
-        <w:t>）线下决赛与成果展示：</w:t>
-      </w:r>
-      <w:r>
-        <w:rPr>
-          <w:rFonts w:ascii="方正仿宋_GB2312" w:eastAsia="方正仿宋_GB2312" w:hAnsi="方正仿宋_GB2312" w:cs="方正仿宋_GB2312" w:hint="eastAsia"/>
-          <w:sz w:val="32"/>
-          <w:szCs w:val="32"/>
-        </w:rPr>
-        <w:t>2026</w:t>
-      </w:r>
-      <w:r>
-        <w:rPr>
-          <w:rFonts w:ascii="方正仿宋_GB2312" w:eastAsia="方正仿宋_GB2312" w:hAnsi="方正仿宋_GB2312" w:cs="方正仿宋_GB2312" w:hint="eastAsia"/>
-          <w:sz w:val="32"/>
-          <w:szCs w:val="32"/>
-        </w:rPr>
-        <w:t>年</w:t>
-      </w:r>
-      <w:r>
-        <w:rPr>
-          <w:rFonts w:ascii="方正仿宋_GB2312" w:eastAsia="方正仿宋_GB2312" w:hAnsi="方正仿宋_GB2312" w:cs="方正仿宋_GB2312" w:hint="eastAsia"/>
-          <w:sz w:val="32"/>
-          <w:szCs w:val="32"/>
-        </w:rPr>
-        <w:t>10</w:t>
-      </w:r>
-      <w:r>
-        <w:rPr>
-          <w:rFonts w:ascii="方正仿宋_GB2312" w:eastAsia="方正仿宋_GB2312" w:hAnsi="方正仿宋_GB2312" w:cs="方正仿宋_GB2312" w:hint="eastAsia"/>
-          <w:sz w:val="32"/>
-          <w:szCs w:val="32"/>
-        </w:rPr>
-        <w:t>月</w:t>
-      </w:r>
-      <w:r>
-        <w:rPr>
-          <w:rFonts w:ascii="方正仿宋_GB2312" w:eastAsia="方正仿宋_GB2312" w:hAnsi="方正仿宋_GB2312" w:cs="方正仿宋_GB2312" w:hint="eastAsia"/>
-          <w:sz w:val="32"/>
-          <w:szCs w:val="32"/>
-        </w:rPr>
-        <w:t>18</w:t>
-      </w:r>
-      <w:r>
-        <w:rPr>
-          <w:rFonts w:ascii="方正仿宋_GB2312" w:eastAsia="方正仿宋_GB2312" w:hAnsi="方正仿宋_GB2312" w:cs="方正仿宋_GB2312" w:hint="eastAsia"/>
-          <w:sz w:val="32"/>
-          <w:szCs w:val="32"/>
-        </w:rPr>
-        <w:t>日至</w:t>
-      </w:r>
-      <w:r>
-        <w:rPr>
-          <w:rFonts w:ascii="方正仿宋_GB2312" w:eastAsia="方正仿宋_GB2312" w:hAnsi="方正仿宋_GB2312" w:cs="方正仿宋_GB2312" w:hint="eastAsia"/>
-          <w:sz w:val="32"/>
-          <w:szCs w:val="32"/>
-        </w:rPr>
-        <w:t>10</w:t>
-      </w:r>
-      <w:r>
-        <w:rPr>
-          <w:rFonts w:ascii="方正仿宋_GB2312" w:eastAsia="方正仿宋_GB2312" w:hAnsi="方正仿宋_GB2312" w:cs="方正仿宋_GB2312" w:hint="eastAsia"/>
-          <w:sz w:val="32"/>
-          <w:szCs w:val="32"/>
-        </w:rPr>
-        <w:t>月</w:t>
-      </w:r>
-      <w:r>
-        <w:rPr>
-          <w:rFonts w:ascii="方正仿宋_GB2312" w:eastAsia="方正仿宋_GB2312" w:hAnsi="方正仿宋_GB2312" w:cs="方正仿宋_GB2312" w:hint="eastAsia"/>
-          <w:sz w:val="32"/>
-          <w:szCs w:val="32"/>
-        </w:rPr>
-        <w:t>31</w:t>
-      </w:r>
-      <w:r>
-        <w:rPr>
-          <w:rFonts w:ascii="方正仿宋_GB2312" w:eastAsia="方正仿宋_GB2312" w:hAnsi="方正仿宋_GB2312" w:cs="方正仿宋_GB2312" w:hint="eastAsia"/>
-          <w:sz w:val="32"/>
-          <w:szCs w:val="32"/>
-        </w:rPr>
-        <w:t>日组织线下路演答辩、项目展示、结果确认和资源对接活动。</w:t>
+        <w:t>请各有关单位高度重视本次大赛组织工作，积极做好宣传动员、项目培育、报名指导和材料审核服务，引导参赛团队围绕真实问题开展真实开发、真实验证和真实表达。</w:t>
       </w:r>
     </w:p>
     <w:p>
@@ -2233,71 +2446,34 @@
           <w:sz w:val="32"/>
           <w:szCs w:val="32"/>
         </w:rPr>
-        <w:t>线下决赛采取“</w:t>
-      </w:r>
-      <w:r>
-        <w:rPr>
-          <w:rFonts w:ascii="方正仿宋_GB2312" w:eastAsia="方正仿宋_GB2312" w:hAnsi="方正仿宋_GB2312" w:cs="方正仿宋_GB2312" w:hint="eastAsia"/>
-          <w:sz w:val="32"/>
-          <w:szCs w:val="32"/>
-        </w:rPr>
-        <w:t>6</w:t>
-      </w:r>
-      <w:r>
-        <w:rPr>
-          <w:rFonts w:ascii="方正仿宋_GB2312" w:eastAsia="方正仿宋_GB2312" w:hAnsi="方正仿宋_GB2312" w:cs="方正仿宋_GB2312" w:hint="eastAsia"/>
-          <w:sz w:val="32"/>
-          <w:szCs w:val="32"/>
-        </w:rPr>
-        <w:t>至</w:t>
-      </w:r>
-      <w:r>
-        <w:rPr>
-          <w:rFonts w:ascii="方正仿宋_GB2312" w:eastAsia="方正仿宋_GB2312" w:hAnsi="方正仿宋_GB2312" w:cs="方正仿宋_GB2312" w:hint="eastAsia"/>
-          <w:sz w:val="32"/>
-          <w:szCs w:val="32"/>
-        </w:rPr>
-        <w:t>8</w:t>
-      </w:r>
-      <w:r>
-        <w:rPr>
-          <w:rFonts w:ascii="方正仿宋_GB2312" w:eastAsia="方正仿宋_GB2312" w:hAnsi="方正仿宋_GB2312" w:cs="方正仿宋_GB2312" w:hint="eastAsia"/>
-          <w:sz w:val="32"/>
-          <w:szCs w:val="32"/>
-        </w:rPr>
-        <w:t>分钟路演展示</w:t>
-      </w:r>
-      <w:r>
-        <w:rPr>
-          <w:rFonts w:ascii="方正仿宋_GB2312" w:eastAsia="方正仿宋_GB2312" w:hAnsi="方正仿宋_GB2312" w:cs="方正仿宋_GB2312" w:hint="eastAsia"/>
-          <w:sz w:val="32"/>
-          <w:szCs w:val="32"/>
-        </w:rPr>
-        <w:t>+4</w:t>
-      </w:r>
-      <w:r>
-        <w:rPr>
-          <w:rFonts w:ascii="方正仿宋_GB2312" w:eastAsia="方正仿宋_GB2312" w:hAnsi="方正仿宋_GB2312" w:cs="方正仿宋_GB2312" w:hint="eastAsia"/>
-          <w:sz w:val="32"/>
-          <w:szCs w:val="32"/>
-        </w:rPr>
-        <w:t>至</w:t>
-      </w:r>
-      <w:r>
-        <w:rPr>
-          <w:rFonts w:ascii="方正仿宋_GB2312" w:eastAsia="方正仿宋_GB2312" w:hAnsi="方正仿宋_GB2312" w:cs="方正仿宋_GB2312" w:hint="eastAsia"/>
-          <w:sz w:val="32"/>
-          <w:szCs w:val="32"/>
-        </w:rPr>
-        <w:t>5</w:t>
-      </w:r>
-      <w:r>
-        <w:rPr>
-          <w:rFonts w:ascii="方正仿宋_GB2312" w:eastAsia="方正仿宋_GB2312" w:hAnsi="方正仿宋_GB2312" w:cs="方正仿宋_GB2312" w:hint="eastAsia"/>
-          <w:sz w:val="32"/>
-          <w:szCs w:val="32"/>
-        </w:rPr>
-        <w:t>分钟专家问答”的方式进行。参赛团队应围绕问题来源、技术方案、阶段成果、演示内容、团队贡献和后续计划进行集中展示。具体时间、地点及入围安排以组委会后续通知为准。</w:t>
+        <w:t>大赛报名表、项目报告书模板、真实性与知识产权承诺书、评审规则及其他配套材料</w:t>
+      </w:r>
+      <w:r>
+        <w:rPr>
+          <w:rFonts w:ascii="方正仿宋_GB2312" w:eastAsia="方正仿宋_GB2312" w:hAnsi="方正仿宋_GB2312" w:cs="方正仿宋_GB2312" w:hint="eastAsia"/>
+          <w:sz w:val="32"/>
+          <w:szCs w:val="32"/>
+        </w:rPr>
+        <w:t>可通过大赛官网“下载中心”页面下载。</w:t>
+      </w:r>
+    </w:p>
+    <w:p>
+      <w:pPr>
+        <w:ind w:firstLineChars="200" w:firstLine="640"/>
+        <w:jc w:val="left"/>
+        <w:rPr>
+          <w:rFonts w:ascii="方正仿宋_GB2312" w:eastAsia="方正仿宋_GB2312" w:hAnsi="方正仿宋_GB2312" w:cs="方正仿宋_GB2312"/>
+          <w:sz w:val="32"/>
+          <w:szCs w:val="32"/>
+        </w:rPr>
+      </w:pPr>
+      <w:r>
+        <w:rPr>
+          <w:rFonts w:ascii="方正仿宋_GB2312" w:eastAsia="方正仿宋_GB2312" w:hAnsi="方正仿宋_GB2312" w:cs="方正仿宋_GB2312" w:hint="eastAsia"/>
+          <w:sz w:val="32"/>
+          <w:szCs w:val="32"/>
+        </w:rPr>
+        <w:t>本通知所涉及内容的最终解释权，归全国大学生智能应用开发大赛组织委员会所有。</w:t>
       </w:r>
     </w:p>
     <w:p>
@@ -2315,287 +2491,7 @@
           <w:sz w:val="32"/>
           <w:szCs w:val="32"/>
         </w:rPr>
-        <w:t>九、评审与奖项</w:t>
-      </w:r>
-    </w:p>
-    <w:p>
-      <w:pPr>
-        <w:ind w:firstLineChars="200" w:firstLine="640"/>
-        <w:jc w:val="left"/>
-        <w:rPr>
-          <w:rFonts w:ascii="方正仿宋_GB2312" w:eastAsia="方正仿宋_GB2312" w:hAnsi="方正仿宋_GB2312" w:cs="方正仿宋_GB2312"/>
-          <w:sz w:val="32"/>
-          <w:szCs w:val="32"/>
-        </w:rPr>
-      </w:pPr>
-      <w:r>
-        <w:rPr>
-          <w:rFonts w:ascii="方正仿宋_GB2312" w:eastAsia="方正仿宋_GB2312" w:hAnsi="方正仿宋_GB2312" w:cs="方正仿宋_GB2312" w:hint="eastAsia"/>
-          <w:sz w:val="32"/>
-          <w:szCs w:val="32"/>
-        </w:rPr>
-        <w:t>大赛评审工作坚持分组评价、分道评价、分阶段评价、公开规范评价原则。初赛阶段采取材料评审方式，重点审查项目材料完整性、逻辑清晰度、开发过程证据、成果基础、发展潜力及赛道适配性；决赛阶段采取路演展示与专家答辩相结合的方式进行，重点考察项目展示效果、现场表达能力、专家问答质量、成果真实性、开发完成度、演示完成度和后续迭代能力。</w:t>
-      </w:r>
-    </w:p>
-    <w:p>
-      <w:pPr>
-        <w:ind w:firstLineChars="200" w:firstLine="640"/>
-        <w:jc w:val="left"/>
-        <w:rPr>
-          <w:rFonts w:ascii="方正仿宋_GB2312" w:eastAsia="方正仿宋_GB2312" w:hAnsi="方正仿宋_GB2312" w:cs="方正仿宋_GB2312"/>
-          <w:sz w:val="32"/>
-          <w:szCs w:val="32"/>
-        </w:rPr>
-      </w:pPr>
-      <w:r>
-        <w:rPr>
-          <w:rFonts w:ascii="方正仿宋_GB2312" w:eastAsia="方正仿宋_GB2312" w:hAnsi="方正仿宋_GB2312" w:cs="方正仿宋_GB2312" w:hint="eastAsia"/>
-          <w:sz w:val="32"/>
-          <w:szCs w:val="32"/>
-        </w:rPr>
-        <w:t>大赛拟设金奖、银奖、铜奖及优秀奖，并可根据赛事组织工作需要设立技术创新奖、场景突破奖、产品匠心奖、优秀指导教师奖、卓越组织奖、协同育人奖等专项及组织支持类奖项。各奖项名称、数量、获奖比例、奖励标准及最终分配方案，由全国大学生智能应用开发大赛组织委员会根据实际报名规模、有效参赛项目数量、各组别与赛道分布情况以及决赛阶段综合表现统筹确定，并另行公布。</w:t>
-      </w:r>
-    </w:p>
-    <w:p>
-      <w:pPr>
-        <w:ind w:firstLineChars="200" w:firstLine="640"/>
-        <w:rPr>
-          <w:rFonts w:ascii="黑体" w:eastAsia="黑体" w:hAnsi="黑体" w:cs="黑体"/>
-          <w:sz w:val="32"/>
-          <w:szCs w:val="32"/>
-        </w:rPr>
-      </w:pPr>
-      <w:r>
-        <w:rPr>
-          <w:rFonts w:ascii="黑体" w:eastAsia="黑体" w:hAnsi="黑体" w:cs="黑体" w:hint="eastAsia"/>
-          <w:sz w:val="32"/>
-          <w:szCs w:val="32"/>
-        </w:rPr>
-        <w:t>十、报名费用</w:t>
-      </w:r>
-    </w:p>
-    <w:p>
-      <w:pPr>
-        <w:ind w:firstLineChars="200" w:firstLine="640"/>
-        <w:jc w:val="left"/>
-        <w:rPr>
-          <w:rFonts w:ascii="方正仿宋_GB2312" w:eastAsia="方正仿宋_GB2312" w:hAnsi="方正仿宋_GB2312" w:cs="方正仿宋_GB2312"/>
-          <w:sz w:val="32"/>
-          <w:szCs w:val="32"/>
-        </w:rPr>
-      </w:pPr>
-      <w:r>
-        <w:rPr>
-          <w:rFonts w:ascii="方正仿宋_GB2312" w:eastAsia="方正仿宋_GB2312" w:hAnsi="方正仿宋_GB2312" w:cs="方正仿宋_GB2312" w:hint="eastAsia"/>
-          <w:sz w:val="32"/>
-          <w:szCs w:val="32"/>
-        </w:rPr>
-        <w:t>本次大赛各参赛组别、各赛道报名费统一标准为每人</w:t>
-      </w:r>
-      <w:r>
-        <w:rPr>
-          <w:rFonts w:ascii="方正仿宋_GB2312" w:eastAsia="方正仿宋_GB2312" w:hAnsi="方正仿宋_GB2312" w:cs="方正仿宋_GB2312" w:hint="eastAsia"/>
-          <w:sz w:val="32"/>
-          <w:szCs w:val="32"/>
-        </w:rPr>
-        <w:t>50</w:t>
-      </w:r>
-      <w:r>
-        <w:rPr>
-          <w:rFonts w:ascii="方正仿宋_GB2312" w:eastAsia="方正仿宋_GB2312" w:hAnsi="方正仿宋_GB2312" w:cs="方正仿宋_GB2312" w:hint="eastAsia"/>
-          <w:sz w:val="32"/>
-          <w:szCs w:val="32"/>
-        </w:rPr>
-        <w:t>元。参赛团队须按实际报名人数缴纳相应费用，即每队报名费用计算公式为：</w:t>
-      </w:r>
-      <w:r>
-        <w:rPr>
-          <w:rFonts w:ascii="方正仿宋_GB2312" w:eastAsia="方正仿宋_GB2312" w:hAnsi="方正仿宋_GB2312" w:cs="方正仿宋_GB2312" w:hint="eastAsia"/>
-          <w:sz w:val="32"/>
-          <w:szCs w:val="32"/>
-        </w:rPr>
-        <w:t>50</w:t>
-      </w:r>
-      <w:r>
-        <w:rPr>
-          <w:rFonts w:ascii="方正仿宋_GB2312" w:eastAsia="方正仿宋_GB2312" w:hAnsi="方正仿宋_GB2312" w:cs="方正仿宋_GB2312" w:hint="eastAsia"/>
-          <w:sz w:val="32"/>
-          <w:szCs w:val="32"/>
-        </w:rPr>
-        <w:t>元</w:t>
-      </w:r>
-      <w:r>
-        <w:rPr>
-          <w:rFonts w:ascii="方正仿宋_GB2312" w:eastAsia="方正仿宋_GB2312" w:hAnsi="方正仿宋_GB2312" w:cs="方正仿宋_GB2312" w:hint="eastAsia"/>
-          <w:sz w:val="32"/>
-          <w:szCs w:val="32"/>
-        </w:rPr>
-        <w:t>/</w:t>
-      </w:r>
-      <w:r>
-        <w:rPr>
-          <w:rFonts w:ascii="方正仿宋_GB2312" w:eastAsia="方正仿宋_GB2312" w:hAnsi="方正仿宋_GB2312" w:cs="方正仿宋_GB2312" w:hint="eastAsia"/>
-          <w:sz w:val="32"/>
-          <w:szCs w:val="32"/>
-        </w:rPr>
-        <w:t>人×实际报名人数。报名缴费成功后，报名费用不予退还。</w:t>
-      </w:r>
-    </w:p>
-    <w:p>
-      <w:pPr>
-        <w:ind w:firstLineChars="200" w:firstLine="640"/>
-        <w:rPr>
-          <w:rFonts w:ascii="黑体" w:eastAsia="黑体" w:hAnsi="黑体" w:cs="黑体"/>
-          <w:sz w:val="32"/>
-          <w:szCs w:val="32"/>
-        </w:rPr>
-      </w:pPr>
-      <w:r>
-        <w:rPr>
-          <w:rFonts w:ascii="黑体" w:eastAsia="黑体" w:hAnsi="黑体" w:cs="黑体" w:hint="eastAsia"/>
-          <w:sz w:val="32"/>
-          <w:szCs w:val="32"/>
-        </w:rPr>
-        <w:t>十一、纪律与要求</w:t>
-      </w:r>
-    </w:p>
-    <w:p>
-      <w:pPr>
-        <w:ind w:firstLineChars="200" w:firstLine="640"/>
-        <w:jc w:val="left"/>
-        <w:rPr>
-          <w:rFonts w:ascii="方正仿宋_GB2312" w:eastAsia="方正仿宋_GB2312" w:hAnsi="方正仿宋_GB2312" w:cs="方正仿宋_GB2312"/>
-          <w:sz w:val="32"/>
-          <w:szCs w:val="32"/>
-        </w:rPr>
-      </w:pPr>
-      <w:r>
-        <w:rPr>
-          <w:rFonts w:ascii="方正仿宋_GB2312" w:eastAsia="方正仿宋_GB2312" w:hAnsi="方正仿宋_GB2312" w:cs="方正仿宋_GB2312" w:hint="eastAsia"/>
-          <w:sz w:val="32"/>
-          <w:szCs w:val="32"/>
-        </w:rPr>
-        <w:t>各参赛团队须严格遵守赛事规则，如实填报报名信息、身份信息、项目材料及相关说明，并按要求全程参与评审、展示和答辩等环节。团队成员须对项目作出实际贡献，不得挂名参赛，不得借用他人成果参赛，不得冒用他人身份参赛，不得虚构团队成员、项目基础、用户数据、合作资源或运营成果。</w:t>
-      </w:r>
-    </w:p>
-    <w:p>
-      <w:pPr>
-        <w:ind w:firstLineChars="200" w:firstLine="640"/>
-        <w:jc w:val="left"/>
-        <w:rPr>
-          <w:rFonts w:ascii="方正仿宋_GB2312" w:eastAsia="方正仿宋_GB2312" w:hAnsi="方正仿宋_GB2312" w:cs="方正仿宋_GB2312"/>
-          <w:sz w:val="32"/>
-          <w:szCs w:val="32"/>
-        </w:rPr>
-      </w:pPr>
-      <w:r>
-        <w:rPr>
-          <w:rFonts w:ascii="方正仿宋_GB2312" w:eastAsia="方正仿宋_GB2312" w:hAnsi="方正仿宋_GB2312" w:cs="方正仿宋_GB2312" w:hint="eastAsia"/>
-          <w:sz w:val="32"/>
-          <w:szCs w:val="32"/>
-        </w:rPr>
-        <w:t>参赛项目必须坚持正确导向，确保内容真实、健康、合法。项目所涉及的发明创造、专利技术、数据资源、代码成果、设计作品、模型样机、合作资源等，须具有清晰、合法、可明确说明的知识产权归属或使用授权。凡经查实存在弄虚作假、侵权违规、冒名参赛、虚假包装等行为的，组委会将取消其参赛资格、获奖资格及相关荣誉；情节严重的，纳入赛事诚信管理范围，并保留依法依规进一步处理的权利。</w:t>
-      </w:r>
-    </w:p>
-    <w:p>
-      <w:pPr>
-        <w:ind w:firstLineChars="200" w:firstLine="640"/>
-        <w:rPr>
-          <w:rFonts w:ascii="黑体" w:eastAsia="黑体" w:hAnsi="黑体" w:cs="黑体"/>
-          <w:sz w:val="32"/>
-          <w:szCs w:val="32"/>
-        </w:rPr>
-      </w:pPr>
-      <w:r>
-        <w:rPr>
-          <w:rFonts w:ascii="黑体" w:eastAsia="黑体" w:hAnsi="黑体" w:cs="黑体" w:hint="eastAsia"/>
-          <w:sz w:val="32"/>
-          <w:szCs w:val="32"/>
-        </w:rPr>
-        <w:t>十二、其他事项</w:t>
-      </w:r>
-    </w:p>
-    <w:p>
-      <w:pPr>
-        <w:ind w:firstLineChars="200" w:firstLine="640"/>
-        <w:jc w:val="left"/>
-        <w:rPr>
-          <w:rFonts w:ascii="方正仿宋_GB2312" w:eastAsia="方正仿宋_GB2312" w:hAnsi="方正仿宋_GB2312" w:cs="方正仿宋_GB2312"/>
-          <w:sz w:val="32"/>
-          <w:szCs w:val="32"/>
-        </w:rPr>
-      </w:pPr>
-      <w:r>
-        <w:rPr>
-          <w:rFonts w:ascii="方正仿宋_GB2312" w:eastAsia="方正仿宋_GB2312" w:hAnsi="方正仿宋_GB2312" w:cs="方正仿宋_GB2312" w:hint="eastAsia"/>
-          <w:sz w:val="32"/>
-          <w:szCs w:val="32"/>
-        </w:rPr>
-        <w:t>请各有关单位高度重视本次大赛组织工作，积极做好宣传动员、项目培育、报名指导和材料审核服务，引导参赛团队围绕真实问题开展真实开发、真实验证和真实表达。</w:t>
-      </w:r>
-    </w:p>
-    <w:p>
-      <w:pPr>
-        <w:ind w:firstLineChars="200" w:firstLine="640"/>
-        <w:jc w:val="left"/>
-        <w:rPr>
-          <w:rFonts w:ascii="方正仿宋_GB2312" w:eastAsia="方正仿宋_GB2312" w:hAnsi="方正仿宋_GB2312" w:cs="方正仿宋_GB2312"/>
-          <w:sz w:val="32"/>
-          <w:szCs w:val="32"/>
-        </w:rPr>
-      </w:pPr>
-      <w:r>
-        <w:rPr>
-          <w:rFonts w:ascii="方正仿宋_GB2312" w:eastAsia="方正仿宋_GB2312" w:hAnsi="方正仿宋_GB2312" w:cs="方正仿宋_GB2312" w:hint="eastAsia"/>
-          <w:sz w:val="32"/>
-          <w:szCs w:val="32"/>
-        </w:rPr>
-        <w:t>大赛报名表、项目报告书模板、真实性与知识产权承诺书、评审规则及其他配套材料</w:t>
-      </w:r>
-      <w:r>
-        <w:rPr>
-          <w:rFonts w:ascii="方正仿宋_GB2312" w:eastAsia="方正仿宋_GB2312" w:hAnsi="方正仿宋_GB2312" w:cs="方正仿宋_GB2312" w:hint="eastAsia"/>
-          <w:sz w:val="32"/>
-          <w:szCs w:val="32"/>
-        </w:rPr>
-        <w:t>可通过大赛官网“下载中心”页面下载。</w:t>
-      </w:r>
-    </w:p>
-    <w:p>
-      <w:pPr>
-        <w:ind w:firstLineChars="200" w:firstLine="640"/>
-        <w:jc w:val="left"/>
-        <w:rPr>
-          <w:rFonts w:ascii="方正仿宋_GB2312" w:eastAsia="方正仿宋_GB2312" w:hAnsi="方正仿宋_GB2312" w:cs="方正仿宋_GB2312"/>
-          <w:sz w:val="32"/>
-          <w:szCs w:val="32"/>
-        </w:rPr>
-      </w:pPr>
-      <w:r>
-        <w:rPr>
-          <w:rFonts w:ascii="方正仿宋_GB2312" w:eastAsia="方正仿宋_GB2312" w:hAnsi="方正仿宋_GB2312" w:cs="方正仿宋_GB2312" w:hint="eastAsia"/>
-          <w:sz w:val="32"/>
-          <w:szCs w:val="32"/>
-        </w:rPr>
-        <w:t>本通知所涉及内容的最终解释权，归全国大学生智能应用开发大赛组织委员会所有。</w:t>
-      </w:r>
-    </w:p>
-    <w:p>
-      <w:pPr>
-        <w:ind w:firstLineChars="200" w:firstLine="640"/>
-        <w:rPr>
-          <w:rFonts w:ascii="黑体" w:eastAsia="黑体" w:hAnsi="黑体" w:cs="黑体"/>
-          <w:sz w:val="32"/>
-          <w:szCs w:val="32"/>
-        </w:rPr>
-      </w:pPr>
-      <w:r>
-        <w:rPr>
-          <w:rFonts w:ascii="黑体" w:eastAsia="黑体" w:hAnsi="黑体" w:cs="黑体" w:hint="eastAsia"/>
-          <w:sz w:val="32"/>
-          <w:szCs w:val="32"/>
-        </w:rPr>
-        <w:t>十三、联系方式</w:t>
+        <w:t xml:space="preserve">十二、联系方式</w:t>
       </w:r>
     </w:p>
     <w:p>

</xml_diff>